<commit_message>
Completed Report for COMP5310
</commit_message>
<xml_diff>
--- a/COMP5310 (Principles of Data Science)  Assignment/Report/Dataset_A_Report.docx
+++ b/COMP5310 (Principles of Data Science)  Assignment/Report/Dataset_A_Report.docx
@@ -118,12 +118,6 @@
         <w:gridCol w:w="5426"/>
       </w:tblGrid>
       <w:tr>
-        <w:tblPrEx>
-          <w:tblCellMar>
-            <w:top w:w="0" w:type="dxa"/>
-            <w:bottom w:w="0" w:type="dxa"/>
-          </w:tblCellMar>
-        </w:tblPrEx>
         <w:tc>
           <w:tcPr>
             <w:tcW w:w="3600" w:type="dxa"/>
@@ -186,12 +180,6 @@
         </w:tc>
       </w:tr>
       <w:tr>
-        <w:tblPrEx>
-          <w:tblCellMar>
-            <w:top w:w="0" w:type="dxa"/>
-            <w:bottom w:w="0" w:type="dxa"/>
-          </w:tblCellMar>
-        </w:tblPrEx>
         <w:tc>
           <w:tcPr>
             <w:tcW w:w="3600" w:type="dxa"/>
@@ -283,12 +271,6 @@
         </w:tc>
       </w:tr>
       <w:tr>
-        <w:tblPrEx>
-          <w:tblCellMar>
-            <w:top w:w="0" w:type="dxa"/>
-            <w:bottom w:w="0" w:type="dxa"/>
-          </w:tblCellMar>
-        </w:tblPrEx>
         <w:tc>
           <w:tcPr>
             <w:tcW w:w="3600" w:type="dxa"/>
@@ -341,12 +323,6 @@
         </w:tc>
       </w:tr>
       <w:tr>
-        <w:tblPrEx>
-          <w:tblCellMar>
-            <w:top w:w="0" w:type="dxa"/>
-            <w:bottom w:w="0" w:type="dxa"/>
-          </w:tblCellMar>
-        </w:tblPrEx>
         <w:tc>
           <w:tcPr>
             <w:tcW w:w="3600" w:type="dxa"/>
@@ -365,7 +341,6 @@
             </w:tcMar>
           </w:tcPr>
           <w:p>
-            <w:proofErr w:type="spellStart"/>
             <w:r>
               <w:rPr>
                 <w:sz w:val="20"/>
@@ -373,7 +348,6 @@
               </w:rPr>
               <w:t>UniKey</w:t>
             </w:r>
-            <w:proofErr w:type="spellEnd"/>
           </w:p>
         </w:tc>
         <w:tc>
@@ -405,12 +379,6 @@
         </w:tc>
       </w:tr>
       <w:tr>
-        <w:tblPrEx>
-          <w:tblCellMar>
-            <w:top w:w="0" w:type="dxa"/>
-            <w:bottom w:w="0" w:type="dxa"/>
-          </w:tblCellMar>
-        </w:tblPrEx>
         <w:tc>
           <w:tcPr>
             <w:tcW w:w="3600" w:type="dxa"/>
@@ -467,12 +435,6 @@
         </w:tc>
       </w:tr>
       <w:tr>
-        <w:tblPrEx>
-          <w:tblCellMar>
-            <w:top w:w="0" w:type="dxa"/>
-            <w:bottom w:w="0" w:type="dxa"/>
-          </w:tblCellMar>
-        </w:tblPrEx>
         <w:tc>
           <w:tcPr>
             <w:tcW w:w="3600" w:type="dxa"/>
@@ -529,12 +491,6 @@
         </w:tc>
       </w:tr>
       <w:tr>
-        <w:tblPrEx>
-          <w:tblCellMar>
-            <w:top w:w="0" w:type="dxa"/>
-            <w:bottom w:w="0" w:type="dxa"/>
-          </w:tblCellMar>
-        </w:tblPrEx>
         <w:tc>
           <w:tcPr>
             <w:tcW w:w="3600" w:type="dxa"/>
@@ -585,14 +541,7 @@
                 <w:sz w:val="20"/>
                 <w:szCs w:val="20"/>
               </w:rPr>
-              <w:t xml:space="preserve">The </w:t>
-            </w:r>
-            <w:r>
-              <w:rPr>
-                <w:sz w:val="20"/>
-                <w:szCs w:val="20"/>
-              </w:rPr>
-              <w:t>University of Sydney</w:t>
+              <w:t>The University of Sydney</w:t>
             </w:r>
           </w:p>
         </w:tc>
@@ -813,12 +762,6 @@
         <w:gridCol w:w="5826"/>
       </w:tblGrid>
       <w:tr>
-        <w:tblPrEx>
-          <w:tblCellMar>
-            <w:top w:w="0" w:type="dxa"/>
-            <w:bottom w:w="0" w:type="dxa"/>
-          </w:tblCellMar>
-        </w:tblPrEx>
         <w:tc>
           <w:tcPr>
             <w:tcW w:w="3200" w:type="dxa"/>
@@ -881,12 +824,6 @@
         </w:tc>
       </w:tr>
       <w:tr>
-        <w:tblPrEx>
-          <w:tblCellMar>
-            <w:top w:w="0" w:type="dxa"/>
-            <w:bottom w:w="0" w:type="dxa"/>
-          </w:tblCellMar>
-        </w:tblPrEx>
         <w:tc>
           <w:tcPr>
             <w:tcW w:w="3200" w:type="dxa"/>
@@ -937,32 +874,12 @@
                 <w:sz w:val="20"/>
                 <w:szCs w:val="20"/>
               </w:rPr>
-              <w:t>Optimize</w:t>
-            </w:r>
-            <w:r>
-              <w:rPr>
-                <w:sz w:val="20"/>
-                <w:szCs w:val="20"/>
-              </w:rPr>
-              <w:t xml:space="preserve"> train scheduling</w:t>
-            </w:r>
-            <w:r>
-              <w:rPr>
-                <w:sz w:val="20"/>
-                <w:szCs w:val="20"/>
-              </w:rPr>
-              <w:t xml:space="preserve"> so that additional services can be deployed during peak hours.</w:t>
+              <w:t>Optimize train scheduling so that additional services can be deployed during peak hours.</w:t>
             </w:r>
           </w:p>
         </w:tc>
       </w:tr>
       <w:tr>
-        <w:tblPrEx>
-          <w:tblCellMar>
-            <w:top w:w="0" w:type="dxa"/>
-            <w:bottom w:w="0" w:type="dxa"/>
-          </w:tblCellMar>
-        </w:tblPrEx>
         <w:tc>
           <w:tcPr>
             <w:tcW w:w="3200" w:type="dxa"/>
@@ -1019,12 +936,6 @@
         </w:tc>
       </w:tr>
       <w:tr>
-        <w:tblPrEx>
-          <w:tblCellMar>
-            <w:top w:w="0" w:type="dxa"/>
-            <w:bottom w:w="0" w:type="dxa"/>
-          </w:tblCellMar>
-        </w:tblPrEx>
         <w:tc>
           <w:tcPr>
             <w:tcW w:w="3200" w:type="dxa"/>
@@ -1102,12 +1013,6 @@
         </w:tc>
       </w:tr>
       <w:tr>
-        <w:tblPrEx>
-          <w:tblCellMar>
-            <w:top w:w="0" w:type="dxa"/>
-            <w:bottom w:w="0" w:type="dxa"/>
-          </w:tblCellMar>
-        </w:tblPrEx>
         <w:trPr>
           <w:trHeight w:val="602"/>
         </w:trPr>
@@ -1372,12 +1277,6 @@
         <w:gridCol w:w="5527"/>
       </w:tblGrid>
       <w:tr>
-        <w:tblPrEx>
-          <w:tblCellMar>
-            <w:top w:w="0" w:type="dxa"/>
-            <w:bottom w:w="0" w:type="dxa"/>
-          </w:tblCellMar>
-        </w:tblPrEx>
         <w:trPr>
           <w:trHeight w:val="258"/>
         </w:trPr>
@@ -1443,12 +1342,6 @@
         </w:tc>
       </w:tr>
       <w:tr>
-        <w:tblPrEx>
-          <w:tblCellMar>
-            <w:top w:w="0" w:type="dxa"/>
-            <w:bottom w:w="0" w:type="dxa"/>
-          </w:tblCellMar>
-        </w:tblPrEx>
         <w:trPr>
           <w:trHeight w:val="245"/>
         </w:trPr>
@@ -1508,12 +1401,6 @@
         </w:tc>
       </w:tr>
       <w:tr>
-        <w:tblPrEx>
-          <w:tblCellMar>
-            <w:top w:w="0" w:type="dxa"/>
-            <w:bottom w:w="0" w:type="dxa"/>
-          </w:tblCellMar>
-        </w:tblPrEx>
         <w:trPr>
           <w:trHeight w:val="258"/>
         </w:trPr>
@@ -1573,12 +1460,6 @@
         </w:tc>
       </w:tr>
       <w:tr>
-        <w:tblPrEx>
-          <w:tblCellMar>
-            <w:top w:w="0" w:type="dxa"/>
-            <w:bottom w:w="0" w:type="dxa"/>
-          </w:tblCellMar>
-        </w:tblPrEx>
         <w:trPr>
           <w:trHeight w:val="258"/>
         </w:trPr>
@@ -1638,12 +1519,6 @@
         </w:tc>
       </w:tr>
       <w:tr>
-        <w:tblPrEx>
-          <w:tblCellMar>
-            <w:top w:w="0" w:type="dxa"/>
-            <w:bottom w:w="0" w:type="dxa"/>
-          </w:tblCellMar>
-        </w:tblPrEx>
         <w:trPr>
           <w:trHeight w:val="245"/>
         </w:trPr>
@@ -1739,12 +1614,6 @@
         <w:gridCol w:w="4226"/>
       </w:tblGrid>
       <w:tr>
-        <w:tblPrEx>
-          <w:tblCellMar>
-            <w:top w:w="0" w:type="dxa"/>
-            <w:bottom w:w="0" w:type="dxa"/>
-          </w:tblCellMar>
-        </w:tblPrEx>
         <w:tc>
           <w:tcPr>
             <w:tcW w:w="2800" w:type="dxa"/>
@@ -1837,12 +1706,6 @@
         </w:tc>
       </w:tr>
       <w:tr>
-        <w:tblPrEx>
-          <w:tblCellMar>
-            <w:top w:w="0" w:type="dxa"/>
-            <w:bottom w:w="0" w:type="dxa"/>
-          </w:tblCellMar>
-        </w:tblPrEx>
         <w:tc>
           <w:tcPr>
             <w:tcW w:w="2800" w:type="dxa"/>
@@ -1926,12 +1789,6 @@
         </w:tc>
       </w:tr>
       <w:tr>
-        <w:tblPrEx>
-          <w:tblCellMar>
-            <w:top w:w="0" w:type="dxa"/>
-            <w:bottom w:w="0" w:type="dxa"/>
-          </w:tblCellMar>
-        </w:tblPrEx>
         <w:tc>
           <w:tcPr>
             <w:tcW w:w="2800" w:type="dxa"/>
@@ -1950,8 +1807,6 @@
             </w:tcMar>
           </w:tcPr>
           <w:p>
-            <w:proofErr w:type="spellStart"/>
-            <w:proofErr w:type="gramStart"/>
             <w:r>
               <w:rPr>
                 <w:sz w:val="20"/>
@@ -1959,8 +1814,6 @@
               </w:rPr>
               <w:t>Node.Seq.Order</w:t>
             </w:r>
-            <w:proofErr w:type="spellEnd"/>
-            <w:proofErr w:type="gramEnd"/>
           </w:p>
         </w:tc>
         <w:tc>
@@ -2019,12 +1872,6 @@
         </w:tc>
       </w:tr>
       <w:tr>
-        <w:tblPrEx>
-          <w:tblCellMar>
-            <w:top w:w="0" w:type="dxa"/>
-            <w:bottom w:w="0" w:type="dxa"/>
-          </w:tblCellMar>
-        </w:tblPrEx>
         <w:tc>
           <w:tcPr>
             <w:tcW w:w="2800" w:type="dxa"/>
@@ -2108,12 +1955,6 @@
         </w:tc>
       </w:tr>
       <w:tr>
-        <w:tblPrEx>
-          <w:tblCellMar>
-            <w:top w:w="0" w:type="dxa"/>
-            <w:bottom w:w="0" w:type="dxa"/>
-          </w:tblCellMar>
-        </w:tblPrEx>
         <w:tc>
           <w:tcPr>
             <w:tcW w:w="2800" w:type="dxa"/>
@@ -2132,7 +1973,6 @@
             </w:tcMar>
           </w:tcPr>
           <w:p>
-            <w:proofErr w:type="spellStart"/>
             <w:r>
               <w:rPr>
                 <w:sz w:val="20"/>
@@ -2140,7 +1980,6 @@
               </w:rPr>
               <w:t>Segment.Direction</w:t>
             </w:r>
-            <w:proofErr w:type="spellEnd"/>
           </w:p>
         </w:tc>
         <w:tc>
@@ -2199,12 +2038,6 @@
         </w:tc>
       </w:tr>
       <w:tr>
-        <w:tblPrEx>
-          <w:tblCellMar>
-            <w:top w:w="0" w:type="dxa"/>
-            <w:bottom w:w="0" w:type="dxa"/>
-          </w:tblCellMar>
-        </w:tblPrEx>
         <w:tc>
           <w:tcPr>
             <w:tcW w:w="2800" w:type="dxa"/>
@@ -2223,7 +2056,6 @@
             </w:tcMar>
           </w:tcPr>
           <w:p>
-            <w:proofErr w:type="spellStart"/>
             <w:r>
               <w:rPr>
                 <w:sz w:val="20"/>
@@ -2231,7 +2063,6 @@
               </w:rPr>
               <w:t>Service.Line</w:t>
             </w:r>
-            <w:proofErr w:type="spellEnd"/>
           </w:p>
         </w:tc>
         <w:tc>
@@ -2290,12 +2121,6 @@
         </w:tc>
       </w:tr>
       <w:tr>
-        <w:tblPrEx>
-          <w:tblCellMar>
-            <w:top w:w="0" w:type="dxa"/>
-            <w:bottom w:w="0" w:type="dxa"/>
-          </w:tblCellMar>
-        </w:tblPrEx>
         <w:trPr>
           <w:trHeight w:val="629"/>
         </w:trPr>
@@ -2422,43 +2247,7 @@
         <w:jc w:val="both"/>
       </w:pPr>
       <w:r>
-        <w:t xml:space="preserve">An initial inspection using </w:t>
-      </w:r>
-      <w:proofErr w:type="spellStart"/>
-      <w:proofErr w:type="gramStart"/>
-      <w:r>
-        <w:t>df.isnull</w:t>
-      </w:r>
-      <w:proofErr w:type="spellEnd"/>
-      <w:proofErr w:type="gramEnd"/>
-      <w:r>
-        <w:t>(</w:t>
-      </w:r>
-      <w:proofErr w:type="gramStart"/>
-      <w:r>
-        <w:t>).sum</w:t>
-      </w:r>
-      <w:proofErr w:type="gramEnd"/>
-      <w:r>
-        <w:t xml:space="preserve">() and </w:t>
-      </w:r>
-      <w:proofErr w:type="spellStart"/>
-      <w:proofErr w:type="gramStart"/>
-      <w:r>
-        <w:t>df.duplicated</w:t>
-      </w:r>
-      <w:proofErr w:type="spellEnd"/>
-      <w:proofErr w:type="gramEnd"/>
-      <w:r>
-        <w:t>(</w:t>
-      </w:r>
-      <w:proofErr w:type="gramStart"/>
-      <w:r>
-        <w:t>).sum</w:t>
-      </w:r>
-      <w:proofErr w:type="gramEnd"/>
-      <w:r>
-        <w:t>() revealed the presence of both missing values and duplicate rows. The exact counts are detailed below:</w:t>
+        <w:t>An initial inspection using df.isnull().sum() and df.duplicated().sum() revealed the presence of both missing values and duplicate rows. The exact counts are detailed below:</w:t>
       </w:r>
     </w:p>
     <w:p>
@@ -2489,12 +2278,6 @@
         <w:gridCol w:w="3398"/>
       </w:tblGrid>
       <w:tr>
-        <w:tblPrEx>
-          <w:tblCellMar>
-            <w:top w:w="0" w:type="dxa"/>
-            <w:bottom w:w="0" w:type="dxa"/>
-          </w:tblCellMar>
-        </w:tblPrEx>
         <w:trPr>
           <w:trHeight w:val="263"/>
         </w:trPr>
@@ -2590,12 +2373,6 @@
         </w:tc>
       </w:tr>
       <w:tr>
-        <w:tblPrEx>
-          <w:tblCellMar>
-            <w:top w:w="0" w:type="dxa"/>
-            <w:bottom w:w="0" w:type="dxa"/>
-          </w:tblCellMar>
-        </w:tblPrEx>
         <w:trPr>
           <w:trHeight w:val="512"/>
         </w:trPr>
@@ -2676,36 +2453,12 @@
                 <w:sz w:val="20"/>
                 <w:szCs w:val="20"/>
               </w:rPr>
-              <w:t xml:space="preserve">Rows with missing values dropped using </w:t>
-            </w:r>
-            <w:proofErr w:type="spellStart"/>
-            <w:proofErr w:type="gramStart"/>
-            <w:r>
-              <w:rPr>
-                <w:sz w:val="20"/>
-                <w:szCs w:val="20"/>
-              </w:rPr>
-              <w:t>df.dropna</w:t>
-            </w:r>
-            <w:proofErr w:type="spellEnd"/>
-            <w:proofErr w:type="gramEnd"/>
-            <w:r>
-              <w:rPr>
-                <w:sz w:val="20"/>
-                <w:szCs w:val="20"/>
-              </w:rPr>
-              <w:t>()</w:t>
+              <w:t>Rows with missing values dropped using df.dropna()</w:t>
             </w:r>
           </w:p>
         </w:tc>
       </w:tr>
       <w:tr>
-        <w:tblPrEx>
-          <w:tblCellMar>
-            <w:top w:w="0" w:type="dxa"/>
-            <w:bottom w:w="0" w:type="dxa"/>
-          </w:tblCellMar>
-        </w:tblPrEx>
         <w:trPr>
           <w:trHeight w:val="526"/>
         </w:trPr>
@@ -2786,59 +2539,12 @@
                 <w:sz w:val="20"/>
                 <w:szCs w:val="20"/>
               </w:rPr>
-              <w:t xml:space="preserve">Removed using </w:t>
-            </w:r>
-            <w:proofErr w:type="spellStart"/>
-            <w:proofErr w:type="gramStart"/>
-            <w:r>
-              <w:rPr>
-                <w:sz w:val="20"/>
-                <w:szCs w:val="20"/>
-              </w:rPr>
-              <w:t>df.drop</w:t>
-            </w:r>
-            <w:proofErr w:type="gramEnd"/>
-            <w:r>
-              <w:rPr>
-                <w:sz w:val="20"/>
-                <w:szCs w:val="20"/>
-              </w:rPr>
-              <w:t>_</w:t>
-            </w:r>
-            <w:proofErr w:type="gramStart"/>
-            <w:r>
-              <w:rPr>
-                <w:sz w:val="20"/>
-                <w:szCs w:val="20"/>
-              </w:rPr>
-              <w:t>duplicates</w:t>
-            </w:r>
-            <w:proofErr w:type="spellEnd"/>
-            <w:r>
-              <w:rPr>
-                <w:sz w:val="20"/>
-                <w:szCs w:val="20"/>
-              </w:rPr>
-              <w:t>(</w:t>
-            </w:r>
-            <w:proofErr w:type="gramEnd"/>
-            <w:r>
-              <w:rPr>
-                <w:sz w:val="20"/>
-                <w:szCs w:val="20"/>
-              </w:rPr>
-              <w:t>)</w:t>
+              <w:t>Removed using df.drop_duplicates()</w:t>
             </w:r>
           </w:p>
         </w:tc>
       </w:tr>
       <w:tr>
-        <w:tblPrEx>
-          <w:tblCellMar>
-            <w:top w:w="0" w:type="dxa"/>
-            <w:bottom w:w="0" w:type="dxa"/>
-          </w:tblCellMar>
-        </w:tblPrEx>
         <w:trPr>
           <w:trHeight w:val="263"/>
         </w:trPr>
@@ -2992,13 +2698,8 @@
         </w:numPr>
         <w:spacing w:before="40" w:after="40"/>
       </w:pPr>
-      <w:proofErr w:type="spellStart"/>
-      <w:r>
-        <w:t>Segment.Direction</w:t>
-      </w:r>
-      <w:proofErr w:type="spellEnd"/>
-      <w:r>
-        <w:t>:</w:t>
+      <w:r>
+        <w:t>Segment.Direction:</w:t>
       </w:r>
       <w:r>
         <w:t xml:space="preserve"> When analyzed it was found that it had 4 unique values in the raw data when in reality only 2 directions existed in the dataset.</w:t>
@@ -3019,13 +2720,8 @@
         </w:numPr>
         <w:spacing w:before="40" w:after="40"/>
       </w:pPr>
-      <w:proofErr w:type="spellStart"/>
-      <w:r>
-        <w:t>Service.Line</w:t>
-      </w:r>
-      <w:proofErr w:type="spellEnd"/>
-      <w:r>
-        <w:t>: M</w:t>
+      <w:r>
+        <w:t>Service.Line: M</w:t>
       </w:r>
       <w:r>
         <w:t>ultiple</w:t>
@@ -3101,14 +2797,7 @@
           <w:b/>
           <w:bCs/>
         </w:rPr>
-        <w:t>“</w:t>
-      </w:r>
-      <w:r>
-        <w:rPr>
-          <w:b/>
-          <w:bCs/>
-        </w:rPr>
-        <w:t xml:space="preserve">Some issues (in Occupancy Status </w:t>
+        <w:t xml:space="preserve">“Some issues (in Occupancy Status </w:t>
       </w:r>
       <w:r>
         <w:rPr>
@@ -3117,21 +2806,12 @@
         </w:rPr>
         <w:t xml:space="preserve">&amp; </w:t>
       </w:r>
-      <w:proofErr w:type="spellStart"/>
       <w:r>
         <w:rPr>
           <w:b/>
           <w:bCs/>
         </w:rPr>
-        <w:t>Segment.Direction</w:t>
-      </w:r>
-      <w:proofErr w:type="spellEnd"/>
-      <w:r>
-        <w:rPr>
-          <w:b/>
-          <w:bCs/>
-        </w:rPr>
-        <w:t>) were discovered iteratively during EDA and fixed retroactively, as noted in the notebook.</w:t>
+        <w:t>Segment.Direction) were discovered iteratively during EDA and fixed retroactively, as noted in the notebook.</w:t>
       </w:r>
       <w:r>
         <w:rPr>
@@ -3170,12 +2850,6 @@
         <w:gridCol w:w="2775"/>
       </w:tblGrid>
       <w:tr>
-        <w:tblPrEx>
-          <w:tblCellMar>
-            <w:top w:w="0" w:type="dxa"/>
-            <w:bottom w:w="0" w:type="dxa"/>
-          </w:tblCellMar>
-        </w:tblPrEx>
         <w:tc>
           <w:tcPr>
             <w:tcW w:w="1800" w:type="dxa"/>
@@ -3298,12 +2972,6 @@
         </w:tc>
       </w:tr>
       <w:tr>
-        <w:tblPrEx>
-          <w:tblCellMar>
-            <w:top w:w="0" w:type="dxa"/>
-            <w:bottom w:w="0" w:type="dxa"/>
-          </w:tblCellMar>
-        </w:tblPrEx>
         <w:trPr>
           <w:trHeight w:val="1583"/>
         </w:trPr>
@@ -3384,25 +3052,7 @@
                 <w:sz w:val="20"/>
                 <w:szCs w:val="20"/>
               </w:rPr>
-              <w:t xml:space="preserve">Dropped rows using </w:t>
-            </w:r>
-            <w:proofErr w:type="spellStart"/>
-            <w:proofErr w:type="gramStart"/>
-            <w:r>
-              <w:rPr>
-                <w:sz w:val="20"/>
-                <w:szCs w:val="20"/>
-              </w:rPr>
-              <w:t>df.dropna</w:t>
-            </w:r>
-            <w:proofErr w:type="spellEnd"/>
-            <w:proofErr w:type="gramEnd"/>
-            <w:r>
-              <w:rPr>
-                <w:sz w:val="20"/>
-                <w:szCs w:val="20"/>
-              </w:rPr>
-              <w:t>()</w:t>
+              <w:t>Dropped rows using df.dropna()</w:t>
             </w:r>
           </w:p>
         </w:tc>
@@ -3512,12 +3162,6 @@
         </w:tc>
       </w:tr>
       <w:tr>
-        <w:tblPrEx>
-          <w:tblCellMar>
-            <w:top w:w="0" w:type="dxa"/>
-            <w:bottom w:w="0" w:type="dxa"/>
-          </w:tblCellMar>
-        </w:tblPrEx>
         <w:tc>
           <w:tcPr>
             <w:tcW w:w="1800" w:type="dxa"/>
@@ -3595,48 +3239,7 @@
                 <w:sz w:val="20"/>
                 <w:szCs w:val="20"/>
               </w:rPr>
-              <w:t xml:space="preserve">Removed using </w:t>
-            </w:r>
-            <w:proofErr w:type="spellStart"/>
-            <w:proofErr w:type="gramStart"/>
-            <w:r>
-              <w:rPr>
-                <w:sz w:val="20"/>
-                <w:szCs w:val="20"/>
-              </w:rPr>
-              <w:t>df.drop</w:t>
-            </w:r>
-            <w:proofErr w:type="gramEnd"/>
-            <w:r>
-              <w:rPr>
-                <w:sz w:val="20"/>
-                <w:szCs w:val="20"/>
-              </w:rPr>
-              <w:t>_</w:t>
-            </w:r>
-            <w:proofErr w:type="gramStart"/>
-            <w:r>
-              <w:rPr>
-                <w:sz w:val="20"/>
-                <w:szCs w:val="20"/>
-              </w:rPr>
-              <w:t>duplicates</w:t>
-            </w:r>
-            <w:proofErr w:type="spellEnd"/>
-            <w:r>
-              <w:rPr>
-                <w:sz w:val="20"/>
-                <w:szCs w:val="20"/>
-              </w:rPr>
-              <w:t>(</w:t>
-            </w:r>
-            <w:proofErr w:type="gramEnd"/>
-            <w:r>
-              <w:rPr>
-                <w:sz w:val="20"/>
-                <w:szCs w:val="20"/>
-              </w:rPr>
-              <w:t>)</w:t>
+              <w:t>Removed using df.drop_duplicates()</w:t>
             </w:r>
           </w:p>
         </w:tc>
@@ -3676,12 +3279,6 @@
         </w:tc>
       </w:tr>
       <w:tr>
-        <w:tblPrEx>
-          <w:tblCellMar>
-            <w:top w:w="0" w:type="dxa"/>
-            <w:bottom w:w="0" w:type="dxa"/>
-          </w:tblCellMar>
-        </w:tblPrEx>
         <w:tc>
           <w:tcPr>
             <w:tcW w:w="1800" w:type="dxa"/>
@@ -3761,39 +3358,12 @@
             </w:tcMar>
           </w:tcPr>
           <w:p>
-            <w:proofErr w:type="spellStart"/>
-            <w:r>
-              <w:rPr>
-                <w:sz w:val="20"/>
-                <w:szCs w:val="20"/>
-              </w:rPr>
-              <w:t>Standardised</w:t>
-            </w:r>
-            <w:proofErr w:type="spellEnd"/>
-            <w:r>
-              <w:rPr>
-                <w:sz w:val="20"/>
-                <w:szCs w:val="20"/>
-              </w:rPr>
-              <w:t xml:space="preserve"> to uppercase using </w:t>
-            </w:r>
-            <w:proofErr w:type="spellStart"/>
-            <w:proofErr w:type="gramStart"/>
-            <w:r>
-              <w:rPr>
-                <w:sz w:val="20"/>
-                <w:szCs w:val="20"/>
-              </w:rPr>
-              <w:t>str.upper</w:t>
-            </w:r>
-            <w:proofErr w:type="spellEnd"/>
-            <w:proofErr w:type="gramEnd"/>
-            <w:r>
-              <w:rPr>
-                <w:sz w:val="20"/>
-                <w:szCs w:val="20"/>
-              </w:rPr>
-              <w:t>()</w:t>
+            <w:r>
+              <w:rPr>
+                <w:sz w:val="20"/>
+                <w:szCs w:val="20"/>
+              </w:rPr>
+              <w:t>Standardised to uppercase using str.upper()</w:t>
             </w:r>
           </w:p>
         </w:tc>
@@ -3833,12 +3403,6 @@
         </w:tc>
       </w:tr>
       <w:tr>
-        <w:tblPrEx>
-          <w:tblCellMar>
-            <w:top w:w="0" w:type="dxa"/>
-            <w:bottom w:w="0" w:type="dxa"/>
-          </w:tblCellMar>
-        </w:tblPrEx>
         <w:tc>
           <w:tcPr>
             <w:tcW w:w="1800" w:type="dxa"/>
@@ -3916,25 +3480,7 @@
                 <w:sz w:val="20"/>
                 <w:szCs w:val="20"/>
               </w:rPr>
-              <w:t xml:space="preserve">Replaced using </w:t>
-            </w:r>
-            <w:proofErr w:type="spellStart"/>
-            <w:proofErr w:type="gramStart"/>
-            <w:r>
-              <w:rPr>
-                <w:sz w:val="20"/>
-                <w:szCs w:val="20"/>
-              </w:rPr>
-              <w:t>df.replace</w:t>
-            </w:r>
-            <w:proofErr w:type="spellEnd"/>
-            <w:proofErr w:type="gramEnd"/>
-            <w:r>
-              <w:rPr>
-                <w:sz w:val="20"/>
-                <w:szCs w:val="20"/>
-              </w:rPr>
-              <w:t>()</w:t>
+              <w:t>Replaced using df.replace()</w:t>
             </w:r>
           </w:p>
         </w:tc>
@@ -3967,12 +3513,6 @@
         </w:tc>
       </w:tr>
       <w:tr>
-        <w:tblPrEx>
-          <w:tblCellMar>
-            <w:top w:w="0" w:type="dxa"/>
-            <w:bottom w:w="0" w:type="dxa"/>
-          </w:tblCellMar>
-        </w:tblPrEx>
         <w:tc>
           <w:tcPr>
             <w:tcW w:w="1800" w:type="dxa"/>
@@ -4050,25 +3590,7 @@
                 <w:sz w:val="20"/>
                 <w:szCs w:val="20"/>
               </w:rPr>
-              <w:t xml:space="preserve">Replaced using </w:t>
-            </w:r>
-            <w:proofErr w:type="spellStart"/>
-            <w:proofErr w:type="gramStart"/>
-            <w:r>
-              <w:rPr>
-                <w:sz w:val="20"/>
-                <w:szCs w:val="20"/>
-              </w:rPr>
-              <w:t>df.replace</w:t>
-            </w:r>
-            <w:proofErr w:type="spellEnd"/>
-            <w:proofErr w:type="gramEnd"/>
-            <w:r>
-              <w:rPr>
-                <w:sz w:val="20"/>
-                <w:szCs w:val="20"/>
-              </w:rPr>
-              <w:t>()</w:t>
+              <w:t>Replaced using df.replace()</w:t>
             </w:r>
           </w:p>
         </w:tc>
@@ -4115,12 +3637,6 @@
         </w:tc>
       </w:tr>
       <w:tr>
-        <w:tblPrEx>
-          <w:tblCellMar>
-            <w:top w:w="0" w:type="dxa"/>
-            <w:bottom w:w="0" w:type="dxa"/>
-          </w:tblCellMar>
-        </w:tblPrEx>
         <w:tc>
           <w:tcPr>
             <w:tcW w:w="1800" w:type="dxa"/>
@@ -4166,7 +3682,6 @@
             </w:tcMar>
           </w:tcPr>
           <w:p>
-            <w:proofErr w:type="spellStart"/>
             <w:r>
               <w:rPr>
                 <w:sz w:val="20"/>
@@ -4174,7 +3689,6 @@
               </w:rPr>
               <w:t>Segment.Direction</w:t>
             </w:r>
-            <w:proofErr w:type="spellEnd"/>
           </w:p>
         </w:tc>
         <w:tc>
@@ -4200,25 +3714,7 @@
                 <w:sz w:val="20"/>
                 <w:szCs w:val="20"/>
               </w:rPr>
-              <w:t xml:space="preserve">Stripped using </w:t>
-            </w:r>
-            <w:proofErr w:type="spellStart"/>
-            <w:proofErr w:type="gramStart"/>
-            <w:r>
-              <w:rPr>
-                <w:sz w:val="20"/>
-                <w:szCs w:val="20"/>
-              </w:rPr>
-              <w:t>str.strip</w:t>
-            </w:r>
-            <w:proofErr w:type="spellEnd"/>
-            <w:proofErr w:type="gramEnd"/>
-            <w:r>
-              <w:rPr>
-                <w:sz w:val="20"/>
-                <w:szCs w:val="20"/>
-              </w:rPr>
-              <w:t>()</w:t>
+              <w:t>Stripped using str.strip()</w:t>
             </w:r>
           </w:p>
         </w:tc>
@@ -4278,6 +3774,9 @@
         <w:spacing w:before="60" w:after="60"/>
       </w:pPr>
       <w:r>
+        <w:rPr>
+          <w:noProof/>
+        </w:rPr>
         <w:lastRenderedPageBreak/>
         <w:drawing>
           <wp:inline distT="0" distB="0" distL="0" distR="0" wp14:anchorId="0134D6D4" wp14:editId="7D71655F">
@@ -4459,31 +3958,13 @@
         <w:t xml:space="preserve">attributes </w:t>
       </w:r>
       <w:r>
-        <w:t xml:space="preserve">(Occupancy Status, </w:t>
-      </w:r>
-      <w:proofErr w:type="spellStart"/>
-      <w:r>
-        <w:t>Segment.Direction</w:t>
-      </w:r>
-      <w:proofErr w:type="spellEnd"/>
-      <w:r>
-        <w:t>) and two numerical</w:t>
+        <w:t>(Occupancy Status, Segment.Direction) and two numerical</w:t>
       </w:r>
       <w:r>
         <w:t xml:space="preserve"> attributes</w:t>
       </w:r>
       <w:r>
-        <w:t xml:space="preserve"> (</w:t>
-      </w:r>
-      <w:proofErr w:type="spellStart"/>
-      <w:proofErr w:type="gramStart"/>
-      <w:r>
-        <w:t>Node.Seq.Order</w:t>
-      </w:r>
-      <w:proofErr w:type="spellEnd"/>
-      <w:proofErr w:type="gramEnd"/>
-      <w:r>
-        <w:t>, day)</w:t>
+        <w:t xml:space="preserve"> (Node.Seq.Order, day)</w:t>
       </w:r>
       <w:r>
         <w:t>. These were c</w:t>
@@ -4515,31 +3996,7 @@
         <w:t>NOTE:</w:t>
       </w:r>
       <w:r>
-        <w:t xml:space="preserve"> Initially </w:t>
-      </w:r>
-      <w:proofErr w:type="spellStart"/>
-      <w:r>
-        <w:t>Service.Line</w:t>
-      </w:r>
-      <w:proofErr w:type="spellEnd"/>
-      <w:r>
-        <w:t xml:space="preserve"> attribute was considered for categorical feature 2, but due to the presence of a huge spectrum of unique categorical values for the attribute, </w:t>
-      </w:r>
-      <w:proofErr w:type="spellStart"/>
-      <w:r>
-        <w:t>Segment.Direction</w:t>
-      </w:r>
-      <w:proofErr w:type="spellEnd"/>
-      <w:r>
-        <w:t xml:space="preserve"> seemed to be a better option than </w:t>
-      </w:r>
-      <w:proofErr w:type="spellStart"/>
-      <w:r>
-        <w:t>Service.Line</w:t>
-      </w:r>
-      <w:proofErr w:type="spellEnd"/>
-      <w:r>
-        <w:t xml:space="preserve"> attribute since it only had 2 unique values upon cleaning of the trailing whitespaces in its values.</w:t>
+        <w:t xml:space="preserve"> Initially Service.Line attribute was considered for categorical feature 2, but due to the presence of a huge spectrum of unique categorical values for the attribute, Segment.Direction seemed to be a better option than Service.Line attribute since it only had 2 unique values upon cleaning of the trailing whitespaces in its values.</w:t>
       </w:r>
     </w:p>
     <w:p>
@@ -4635,6 +4092,9 @@
         <w:jc w:val="both"/>
       </w:pPr>
       <w:r>
+        <w:rPr>
+          <w:noProof/>
+        </w:rPr>
         <w:drawing>
           <wp:inline distT="0" distB="0" distL="0" distR="0" wp14:anchorId="5DEAA1BE" wp14:editId="20EC87FE">
             <wp:extent cx="5731510" cy="2819400"/>
@@ -4876,6 +4336,9 @@
     </w:p>
     <w:p>
       <w:r>
+        <w:rPr>
+          <w:noProof/>
+        </w:rPr>
         <w:lastRenderedPageBreak/>
         <w:drawing>
           <wp:inline distT="0" distB="0" distL="0" distR="0" wp14:anchorId="588CF3EC" wp14:editId="1E474AE9">
@@ -5015,17 +4478,7 @@
         <w:t>visualize</w:t>
       </w:r>
       <w:r>
-        <w:t xml:space="preserve"> the distribution of </w:t>
-      </w:r>
-      <w:proofErr w:type="spellStart"/>
-      <w:proofErr w:type="gramStart"/>
-      <w:r>
-        <w:t>Node.Seq.Order</w:t>
-      </w:r>
-      <w:proofErr w:type="spellEnd"/>
-      <w:proofErr w:type="gramEnd"/>
-      <w:r>
-        <w:t>, which represents the position of a station within a route (stop 1 being the first stop, stop 35 being the last on the longest routes).</w:t>
+        <w:t xml:space="preserve"> the distribution of Node.Seq.Order, which represents the position of a station within a route (stop 1 being the first stop, stop 35 being the last on the longest routes).</w:t>
       </w:r>
     </w:p>
     <w:p>
@@ -5053,6 +4506,9 @@
         <w:spacing w:before="60" w:after="60"/>
       </w:pPr>
       <w:r>
+        <w:rPr>
+          <w:noProof/>
+        </w:rPr>
         <w:drawing>
           <wp:inline distT="0" distB="0" distL="0" distR="0" wp14:anchorId="68B15911" wp14:editId="67891058">
             <wp:extent cx="5731510" cy="2980055"/>
@@ -5118,14 +4574,7 @@
           <w:i/>
           <w:iCs/>
         </w:rPr>
-        <w:t xml:space="preserve"> </w:t>
-      </w:r>
-      <w:r>
-        <w:rPr>
-          <w:i/>
-          <w:iCs/>
-        </w:rPr>
-        <w:t>Distribution of Node Sequence Order — frequency of observations per stop position</w:t>
+        <w:t xml:space="preserve"> Distribution of Node Sequence Order — frequency of observations per stop position</w:t>
       </w:r>
     </w:p>
     <w:p>
@@ -5282,19 +4731,13 @@
         <w:jc w:val="both"/>
       </w:pPr>
       <w:r>
-        <w:t>Hence, a</w:t>
-      </w:r>
-      <w:r>
-        <w:t xml:space="preserve"> bar chart was used to </w:t>
+        <w:t xml:space="preserve">Hence, a bar chart was used to </w:t>
       </w:r>
       <w:r>
         <w:t>visualize</w:t>
       </w:r>
       <w:r>
-        <w:t xml:space="preserve"> the number of train services recorded per calendar day, providing a clearer view than a histogram given the discrete nature of the day values</w:t>
-      </w:r>
-      <w:r>
-        <w:t>.</w:t>
+        <w:t xml:space="preserve"> the number of train services recorded per calendar day, providing a clearer view than a histogram given the discrete nature of the day values.</w:t>
       </w:r>
     </w:p>
     <w:p>
@@ -5308,6 +4751,9 @@
         <w:spacing w:before="60" w:after="60"/>
       </w:pPr>
       <w:r>
+        <w:rPr>
+          <w:noProof/>
+        </w:rPr>
         <w:drawing>
           <wp:inline distT="0" distB="0" distL="0" distR="0" wp14:anchorId="71E9F034" wp14:editId="6C4CA747">
             <wp:extent cx="5731510" cy="3084195"/>
@@ -5359,14 +4805,7 @@
           <w:i/>
           <w:iCs/>
         </w:rPr>
-        <w:t xml:space="preserve">Figure 5: </w:t>
-      </w:r>
-      <w:r>
-        <w:rPr>
-          <w:i/>
-          <w:iCs/>
-        </w:rPr>
-        <w:t>Number of train services recorded per calendar day (days 9–16)</w:t>
+        <w:t>Figure 5: Number of train services recorded per calendar day (days 9–16)</w:t>
       </w:r>
     </w:p>
     <w:p>
@@ -5525,15 +4964,8 @@
         <w:t xml:space="preserve">: </w:t>
       </w:r>
       <w:r>
-        <w:t xml:space="preserve">day and </w:t>
-      </w:r>
-      <w:proofErr w:type="spellStart"/>
-      <w:proofErr w:type="gramStart"/>
-      <w:r>
-        <w:t>Node.Seq.Order</w:t>
-      </w:r>
-      <w:proofErr w:type="spellEnd"/>
-      <w:proofErr w:type="gramEnd"/>
+        <w:t>day and Node.Seq.Order</w:t>
+      </w:r>
       <w:r>
         <w:t xml:space="preserve">, </w:t>
       </w:r>
@@ -5618,26 +5050,8 @@
           <w:i/>
           <w:iCs/>
         </w:rPr>
-        <w:t xml:space="preserve">Figure 6: </w:t>
-      </w:r>
-      <w:r>
-        <w:rPr>
-          <w:i/>
-          <w:iCs/>
-        </w:rPr>
-        <w:t xml:space="preserve">Correlation matrix between day and </w:t>
-      </w:r>
-      <w:proofErr w:type="spellStart"/>
-      <w:proofErr w:type="gramStart"/>
-      <w:r>
-        <w:rPr>
-          <w:i/>
-          <w:iCs/>
-        </w:rPr>
-        <w:t>Node.Seq.Order</w:t>
-      </w:r>
-      <w:proofErr w:type="spellEnd"/>
-      <w:proofErr w:type="gramEnd"/>
+        <w:t>Figure 6: Correlation matrix between day and Node.Seq.Order</w:t>
+      </w:r>
     </w:p>
     <w:p>
       <w:pPr>
@@ -5687,12 +5101,6 @@
         <w:gridCol w:w="3526"/>
       </w:tblGrid>
       <w:tr>
-        <w:tblPrEx>
-          <w:tblCellMar>
-            <w:top w:w="0" w:type="dxa"/>
-            <w:bottom w:w="0" w:type="dxa"/>
-          </w:tblCellMar>
-        </w:tblPrEx>
         <w:tc>
           <w:tcPr>
             <w:tcW w:w="3000" w:type="dxa"/>
@@ -5785,12 +5193,6 @@
         </w:tc>
       </w:tr>
       <w:tr>
-        <w:tblPrEx>
-          <w:tblCellMar>
-            <w:top w:w="0" w:type="dxa"/>
-            <w:bottom w:w="0" w:type="dxa"/>
-          </w:tblCellMar>
-        </w:tblPrEx>
         <w:tc>
           <w:tcPr>
             <w:tcW w:w="3000" w:type="dxa"/>
@@ -5814,19 +5216,8 @@
                 <w:sz w:val="20"/>
                 <w:szCs w:val="20"/>
               </w:rPr>
-              <w:t xml:space="preserve">day vs </w:t>
-            </w:r>
-            <w:proofErr w:type="spellStart"/>
-            <w:proofErr w:type="gramStart"/>
-            <w:r>
-              <w:rPr>
-                <w:sz w:val="20"/>
-                <w:szCs w:val="20"/>
-              </w:rPr>
-              <w:t>Node.Seq.Order</w:t>
-            </w:r>
-            <w:proofErr w:type="spellEnd"/>
-            <w:proofErr w:type="gramEnd"/>
+              <w:t>day vs Node.Seq.Order</w:t>
+            </w:r>
           </w:p>
         </w:tc>
         <w:tc>
@@ -5885,12 +5276,6 @@
         </w:tc>
       </w:tr>
       <w:tr>
-        <w:tblPrEx>
-          <w:tblCellMar>
-            <w:top w:w="0" w:type="dxa"/>
-            <w:bottom w:w="0" w:type="dxa"/>
-          </w:tblCellMar>
-        </w:tblPrEx>
         <w:tc>
           <w:tcPr>
             <w:tcW w:w="3000" w:type="dxa"/>
@@ -5974,12 +5359,6 @@
         </w:tc>
       </w:tr>
       <w:tr>
-        <w:tblPrEx>
-          <w:tblCellMar>
-            <w:top w:w="0" w:type="dxa"/>
-            <w:bottom w:w="0" w:type="dxa"/>
-          </w:tblCellMar>
-        </w:tblPrEx>
         <w:tc>
           <w:tcPr>
             <w:tcW w:w="3000" w:type="dxa"/>
@@ -5998,35 +5377,13 @@
             </w:tcMar>
           </w:tcPr>
           <w:p>
-            <w:proofErr w:type="spellStart"/>
-            <w:proofErr w:type="gramStart"/>
-            <w:r>
-              <w:rPr>
-                <w:sz w:val="20"/>
-                <w:szCs w:val="20"/>
-              </w:rPr>
-              <w:t>Node.Seq.Order</w:t>
-            </w:r>
-            <w:proofErr w:type="spellEnd"/>
-            <w:proofErr w:type="gramEnd"/>
-            <w:r>
-              <w:rPr>
-                <w:sz w:val="20"/>
-                <w:szCs w:val="20"/>
-              </w:rPr>
-              <w:t xml:space="preserve"> vs </w:t>
-            </w:r>
-            <w:proofErr w:type="spellStart"/>
-            <w:proofErr w:type="gramStart"/>
-            <w:r>
-              <w:rPr>
-                <w:sz w:val="20"/>
-                <w:szCs w:val="20"/>
-              </w:rPr>
-              <w:t>Node.Seq.Order</w:t>
-            </w:r>
-            <w:proofErr w:type="spellEnd"/>
-            <w:proofErr w:type="gramEnd"/>
+            <w:r>
+              <w:rPr>
+                <w:sz w:val="20"/>
+                <w:szCs w:val="20"/>
+              </w:rPr>
+              <w:t>Node.Seq.Order vs Node.Seq.Order</w:t>
+            </w:r>
           </w:p>
         </w:tc>
         <w:tc>
@@ -6096,17 +5453,7 @@
         <w:jc w:val="both"/>
       </w:pPr>
       <w:r>
-        <w:t xml:space="preserve">Insight: The correlation between day and </w:t>
-      </w:r>
-      <w:proofErr w:type="spellStart"/>
-      <w:proofErr w:type="gramStart"/>
-      <w:r>
-        <w:t>Node.Seq.Order</w:t>
-      </w:r>
-      <w:proofErr w:type="spellEnd"/>
-      <w:proofErr w:type="gramEnd"/>
-      <w:r>
-        <w:t xml:space="preserve"> is -0.009, </w:t>
+        <w:t xml:space="preserve">Insight: The correlation between day and Node.Seq.Order is -0.009, </w:t>
       </w:r>
       <w:r>
         <w:t>indicating virtually no linear relationship</w:t>
@@ -6185,12 +5532,6 @@
         <w:gridCol w:w="5106"/>
       </w:tblGrid>
       <w:tr>
-        <w:tblPrEx>
-          <w:tblCellMar>
-            <w:top w:w="0" w:type="dxa"/>
-            <w:bottom w:w="0" w:type="dxa"/>
-          </w:tblCellMar>
-        </w:tblPrEx>
         <w:trPr>
           <w:trHeight w:val="259"/>
         </w:trPr>
@@ -6286,12 +5627,6 @@
         </w:tc>
       </w:tr>
       <w:tr>
-        <w:tblPrEx>
-          <w:tblCellMar>
-            <w:top w:w="0" w:type="dxa"/>
-            <w:bottom w:w="0" w:type="dxa"/>
-          </w:tblCellMar>
-        </w:tblPrEx>
         <w:trPr>
           <w:trHeight w:val="505"/>
         </w:trPr>
@@ -6420,12 +5755,6 @@
         </w:tc>
       </w:tr>
       <w:tr>
-        <w:tblPrEx>
-          <w:tblCellMar>
-            <w:top w:w="0" w:type="dxa"/>
-            <w:bottom w:w="0" w:type="dxa"/>
-          </w:tblCellMar>
-        </w:tblPrEx>
         <w:trPr>
           <w:trHeight w:val="518"/>
         </w:trPr>
@@ -6447,7 +5776,6 @@
             </w:tcMar>
           </w:tcPr>
           <w:p>
-            <w:proofErr w:type="spellStart"/>
             <w:r>
               <w:rPr>
                 <w:sz w:val="20"/>
@@ -6455,7 +5783,6 @@
               </w:rPr>
               <w:t>Segment.Direction</w:t>
             </w:r>
-            <w:proofErr w:type="spellEnd"/>
           </w:p>
         </w:tc>
         <w:tc>
@@ -6535,12 +5862,6 @@
         </w:tc>
       </w:tr>
       <w:tr>
-        <w:tblPrEx>
-          <w:tblCellMar>
-            <w:top w:w="0" w:type="dxa"/>
-            <w:bottom w:w="0" w:type="dxa"/>
-          </w:tblCellMar>
-        </w:tblPrEx>
         <w:trPr>
           <w:trHeight w:val="518"/>
         </w:trPr>
@@ -6562,8 +5883,6 @@
             </w:tcMar>
           </w:tcPr>
           <w:p>
-            <w:proofErr w:type="spellStart"/>
-            <w:proofErr w:type="gramStart"/>
             <w:r>
               <w:rPr>
                 <w:sz w:val="20"/>
@@ -6571,8 +5890,6 @@
               </w:rPr>
               <w:t>Node.Seq.Order</w:t>
             </w:r>
-            <w:proofErr w:type="spellEnd"/>
-            <w:proofErr w:type="gramEnd"/>
           </w:p>
         </w:tc>
         <w:tc>
@@ -6659,12 +5976,6 @@
         </w:tc>
       </w:tr>
       <w:tr>
-        <w:tblPrEx>
-          <w:tblCellMar>
-            <w:top w:w="0" w:type="dxa"/>
-            <w:bottom w:w="0" w:type="dxa"/>
-          </w:tblCellMar>
-        </w:tblPrEx>
         <w:trPr>
           <w:trHeight w:val="518"/>
         </w:trPr>
@@ -6786,12 +6097,6 @@
         </w:tc>
       </w:tr>
       <w:tr>
-        <w:tblPrEx>
-          <w:tblCellMar>
-            <w:top w:w="0" w:type="dxa"/>
-            <w:bottom w:w="0" w:type="dxa"/>
-          </w:tblCellMar>
-        </w:tblPrEx>
         <w:trPr>
           <w:trHeight w:val="518"/>
         </w:trPr>
@@ -6818,19 +6123,8 @@
                 <w:sz w:val="20"/>
                 <w:szCs w:val="20"/>
               </w:rPr>
-              <w:t xml:space="preserve">day vs </w:t>
-            </w:r>
-            <w:proofErr w:type="spellStart"/>
-            <w:proofErr w:type="gramStart"/>
-            <w:r>
-              <w:rPr>
-                <w:sz w:val="20"/>
-                <w:szCs w:val="20"/>
-              </w:rPr>
-              <w:t>Node.Seq.Order</w:t>
-            </w:r>
-            <w:proofErr w:type="spellEnd"/>
-            <w:proofErr w:type="gramEnd"/>
+              <w:t>day vs Node.Seq.Order</w:t>
+            </w:r>
           </w:p>
         </w:tc>
         <w:tc>
@@ -6949,28 +6243,21 @@
           <w:sz w:val="28"/>
           <w:szCs w:val="28"/>
         </w:rPr>
-        <w:t>code;</w:t>
+        <w:t>code</w:t>
       </w:r>
       <w:r>
         <w:rPr>
           <w:sz w:val="28"/>
           <w:szCs w:val="28"/>
         </w:rPr>
-        <w:t xml:space="preserve"> data analysis, </w:t>
+        <w:t xml:space="preserve">, </w:t>
       </w:r>
       <w:r>
         <w:rPr>
           <w:sz w:val="28"/>
           <w:szCs w:val="28"/>
         </w:rPr>
-        <w:t>visualizations</w:t>
-      </w:r>
-      <w:r>
-        <w:rPr>
-          <w:sz w:val="28"/>
-          <w:szCs w:val="28"/>
-        </w:rPr>
-        <w:t>, cleaning decisions, and final written content are my own. I reviewed, paraphrased, and validated all AI-suggested content before inclusion in this report.</w:t>
+        <w:t>data analysis, visualizations, cleaning decisions, and final written content are my own. I reviewed, paraphrased, and validated all AI-suggested content before inclusion in this report.</w:t>
       </w:r>
     </w:p>
     <w:p>
@@ -7061,21 +6348,7 @@
           <w:sz w:val="28"/>
           <w:szCs w:val="28"/>
         </w:rPr>
-        <w:t xml:space="preserve">My own contribution: All analysis, data cleaning, code, </w:t>
-      </w:r>
-      <w:r>
-        <w:rPr>
-          <w:sz w:val="28"/>
-          <w:szCs w:val="28"/>
-        </w:rPr>
-        <w:t>visualizations</w:t>
-      </w:r>
-      <w:r>
-        <w:rPr>
-          <w:sz w:val="28"/>
-          <w:szCs w:val="28"/>
-        </w:rPr>
-        <w:t>, and final conclusions are my own.</w:t>
+        <w:t>My own contribution: All analysis, data cleaning, code, visualizations, and final conclusions are my own.</w:t>
       </w:r>
     </w:p>
     <w:p>
@@ -7747,6 +7020,7 @@
   <w:style w:type="character" w:default="1" w:styleId="DefaultParagraphFont">
     <w:name w:val="Default Paragraph Font"/>
     <w:uiPriority w:val="1"/>
+    <w:semiHidden/>
     <w:unhideWhenUsed/>
   </w:style>
   <w:style w:type="table" w:default="1" w:styleId="TableNormal">

</xml_diff>

<commit_message>
Report and Code Completed
</commit_message>
<xml_diff>
--- a/COMP5310 (Principles of Data Science)  Assignment/Report/Dataset_A_Report.docx
+++ b/COMP5310 (Principles of Data Science)  Assignment/Report/Dataset_A_Report.docx
@@ -341,6 +341,7 @@
             </w:tcMar>
           </w:tcPr>
           <w:p>
+            <w:proofErr w:type="spellStart"/>
             <w:r>
               <w:rPr>
                 <w:sz w:val="20"/>
@@ -348,6 +349,7 @@
               </w:rPr>
               <w:t>UniKey</w:t>
             </w:r>
+            <w:proofErr w:type="spellEnd"/>
           </w:p>
         </w:tc>
         <w:tc>
@@ -742,7 +744,7 @@
     </w:p>
     <w:tbl>
       <w:tblPr>
-        <w:tblW w:w="9026" w:type="dxa"/>
+        <w:tblW w:w="9251" w:type="dxa"/>
         <w:tblBorders>
           <w:top w:val="single" w:sz="4" w:space="0" w:color="auto"/>
           <w:left w:val="single" w:sz="4" w:space="0" w:color="auto"/>
@@ -758,13 +760,16 @@
         <w:tblLook w:val="04A0" w:firstRow="1" w:lastRow="0" w:firstColumn="1" w:lastColumn="0" w:noHBand="0" w:noVBand="1"/>
       </w:tblPr>
       <w:tblGrid>
-        <w:gridCol w:w="3200"/>
-        <w:gridCol w:w="5826"/>
+        <w:gridCol w:w="3280"/>
+        <w:gridCol w:w="5971"/>
       </w:tblGrid>
       <w:tr>
-        <w:tc>
-          <w:tcPr>
-            <w:tcW w:w="3200" w:type="dxa"/>
+        <w:trPr>
+          <w:trHeight w:val="353"/>
+        </w:trPr>
+        <w:tc>
+          <w:tcPr>
+            <w:tcW w:w="3280" w:type="dxa"/>
             <w:tcBorders>
               <w:top w:val="single" w:sz="1" w:space="0" w:color="CCCCCC"/>
               <w:left w:val="single" w:sz="1" w:space="0" w:color="CCCCCC"/>
@@ -794,7 +799,7 @@
         </w:tc>
         <w:tc>
           <w:tcPr>
-            <w:tcW w:w="5826" w:type="dxa"/>
+            <w:tcW w:w="5971" w:type="dxa"/>
             <w:tcBorders>
               <w:top w:val="single" w:sz="1" w:space="0" w:color="CCCCCC"/>
               <w:left w:val="single" w:sz="1" w:space="0" w:color="CCCCCC"/>
@@ -824,9 +829,12 @@
         </w:tc>
       </w:tr>
       <w:tr>
-        <w:tc>
-          <w:tcPr>
-            <w:tcW w:w="3200" w:type="dxa"/>
+        <w:trPr>
+          <w:trHeight w:val="690"/>
+        </w:trPr>
+        <w:tc>
+          <w:tcPr>
+            <w:tcW w:w="3280" w:type="dxa"/>
             <w:tcBorders>
               <w:top w:val="single" w:sz="1" w:space="0" w:color="CCCCCC"/>
               <w:left w:val="single" w:sz="1" w:space="0" w:color="CCCCCC"/>
@@ -853,7 +861,7 @@
         </w:tc>
         <w:tc>
           <w:tcPr>
-            <w:tcW w:w="5826" w:type="dxa"/>
+            <w:tcW w:w="5971" w:type="dxa"/>
             <w:tcBorders>
               <w:top w:val="single" w:sz="1" w:space="0" w:color="CCCCCC"/>
               <w:left w:val="single" w:sz="1" w:space="0" w:color="CCCCCC"/>
@@ -875,150 +883,17 @@
                 <w:szCs w:val="20"/>
               </w:rPr>
               <w:t>Optimize train scheduling so that additional services can be deployed during peak hours.</w:t>
-            </w:r>
-          </w:p>
-        </w:tc>
-      </w:tr>
-      <w:tr>
-        <w:tc>
-          <w:tcPr>
-            <w:tcW w:w="3200" w:type="dxa"/>
-            <w:tcBorders>
-              <w:top w:val="single" w:sz="1" w:space="0" w:color="CCCCCC"/>
-              <w:left w:val="single" w:sz="1" w:space="0" w:color="CCCCCC"/>
-              <w:bottom w:val="single" w:sz="1" w:space="0" w:color="CCCCCC"/>
-              <w:right w:val="single" w:sz="1" w:space="0" w:color="CCCCCC"/>
-            </w:tcBorders>
-            <w:shd w:val="clear" w:color="auto" w:fill="FFFFFF"/>
-            <w:tcMar>
-              <w:top w:w="80" w:type="dxa"/>
-              <w:left w:w="120" w:type="dxa"/>
-              <w:bottom w:w="80" w:type="dxa"/>
-              <w:right w:w="120" w:type="dxa"/>
-            </w:tcMar>
-          </w:tcPr>
-          <w:p>
-            <w:r>
-              <w:rPr>
-                <w:sz w:val="20"/>
-                <w:szCs w:val="20"/>
-              </w:rPr>
-              <w:t>Commuters</w:t>
-            </w:r>
-          </w:p>
-        </w:tc>
-        <w:tc>
-          <w:tcPr>
-            <w:tcW w:w="5826" w:type="dxa"/>
-            <w:tcBorders>
-              <w:top w:val="single" w:sz="1" w:space="0" w:color="CCCCCC"/>
-              <w:left w:val="single" w:sz="1" w:space="0" w:color="CCCCCC"/>
-              <w:bottom w:val="single" w:sz="1" w:space="0" w:color="CCCCCC"/>
-              <w:right w:val="single" w:sz="1" w:space="0" w:color="CCCCCC"/>
-            </w:tcBorders>
-            <w:shd w:val="clear" w:color="auto" w:fill="FFFFFF"/>
-            <w:tcMar>
-              <w:top w:w="80" w:type="dxa"/>
-              <w:left w:w="120" w:type="dxa"/>
-              <w:bottom w:w="80" w:type="dxa"/>
-              <w:right w:w="120" w:type="dxa"/>
-            </w:tcMar>
-          </w:tcPr>
-          <w:p>
-            <w:r>
-              <w:rPr>
-                <w:sz w:val="20"/>
-                <w:szCs w:val="20"/>
-              </w:rPr>
-              <w:t>Will be able to plan less crowded journeys and save time.</w:t>
-            </w:r>
-          </w:p>
-        </w:tc>
-      </w:tr>
-      <w:tr>
-        <w:tc>
-          <w:tcPr>
-            <w:tcW w:w="3200" w:type="dxa"/>
-            <w:tcBorders>
-              <w:top w:val="single" w:sz="1" w:space="0" w:color="CCCCCC"/>
-              <w:left w:val="single" w:sz="1" w:space="0" w:color="CCCCCC"/>
-              <w:bottom w:val="single" w:sz="1" w:space="0" w:color="CCCCCC"/>
-              <w:right w:val="single" w:sz="1" w:space="0" w:color="CCCCCC"/>
-            </w:tcBorders>
-            <w:shd w:val="clear" w:color="auto" w:fill="EBF3FB"/>
-            <w:tcMar>
-              <w:top w:w="80" w:type="dxa"/>
-              <w:left w:w="120" w:type="dxa"/>
-              <w:bottom w:w="80" w:type="dxa"/>
-              <w:right w:w="120" w:type="dxa"/>
-            </w:tcMar>
-          </w:tcPr>
-          <w:p>
-            <w:r>
-              <w:rPr>
-                <w:sz w:val="20"/>
-                <w:szCs w:val="20"/>
-              </w:rPr>
-              <w:t>City Planners</w:t>
-            </w:r>
-          </w:p>
-        </w:tc>
-        <w:tc>
-          <w:tcPr>
-            <w:tcW w:w="5826" w:type="dxa"/>
-            <w:tcBorders>
-              <w:top w:val="single" w:sz="1" w:space="0" w:color="CCCCCC"/>
-              <w:left w:val="single" w:sz="1" w:space="0" w:color="CCCCCC"/>
-              <w:bottom w:val="single" w:sz="1" w:space="0" w:color="CCCCCC"/>
-              <w:right w:val="single" w:sz="1" w:space="0" w:color="CCCCCC"/>
-            </w:tcBorders>
-            <w:shd w:val="clear" w:color="auto" w:fill="EBF3FB"/>
-            <w:tcMar>
-              <w:top w:w="80" w:type="dxa"/>
-              <w:left w:w="120" w:type="dxa"/>
-              <w:bottom w:w="80" w:type="dxa"/>
-              <w:right w:w="120" w:type="dxa"/>
-            </w:tcMar>
-          </w:tcPr>
-          <w:p>
-            <w:r>
-              <w:rPr>
-                <w:sz w:val="20"/>
-                <w:szCs w:val="20"/>
-              </w:rPr>
-              <w:t>Understand peak demand patterns to i</w:t>
-            </w:r>
-            <w:r>
-              <w:rPr>
-                <w:sz w:val="20"/>
-                <w:szCs w:val="20"/>
-              </w:rPr>
-              <w:t>mprove</w:t>
-            </w:r>
-            <w:r>
-              <w:rPr>
-                <w:sz w:val="20"/>
-                <w:szCs w:val="20"/>
-              </w:rPr>
-              <w:t xml:space="preserve"> infrastructure decisions</w:t>
-            </w:r>
-            <w:r>
-              <w:rPr>
-                <w:sz w:val="20"/>
-                <w:szCs w:val="20"/>
-              </w:rPr>
-              <w:t>.</w:t>
             </w:r>
           </w:p>
         </w:tc>
       </w:tr>
       <w:tr>
         <w:trPr>
-          <w:trHeight w:val="602"/>
+          <w:trHeight w:val="353"/>
         </w:trPr>
         <w:tc>
           <w:tcPr>
-            <w:tcW w:w="3200" w:type="dxa"/>
+            <w:tcW w:w="3280" w:type="dxa"/>
             <w:tcBorders>
               <w:top w:val="single" w:sz="1" w:space="0" w:color="CCCCCC"/>
               <w:left w:val="single" w:sz="1" w:space="0" w:color="CCCCCC"/>
@@ -1039,13 +914,152 @@
                 <w:sz w:val="20"/>
                 <w:szCs w:val="20"/>
               </w:rPr>
+              <w:t>Commuters</w:t>
+            </w:r>
+          </w:p>
+        </w:tc>
+        <w:tc>
+          <w:tcPr>
+            <w:tcW w:w="5971" w:type="dxa"/>
+            <w:tcBorders>
+              <w:top w:val="single" w:sz="1" w:space="0" w:color="CCCCCC"/>
+              <w:left w:val="single" w:sz="1" w:space="0" w:color="CCCCCC"/>
+              <w:bottom w:val="single" w:sz="1" w:space="0" w:color="CCCCCC"/>
+              <w:right w:val="single" w:sz="1" w:space="0" w:color="CCCCCC"/>
+            </w:tcBorders>
+            <w:shd w:val="clear" w:color="auto" w:fill="FFFFFF"/>
+            <w:tcMar>
+              <w:top w:w="80" w:type="dxa"/>
+              <w:left w:w="120" w:type="dxa"/>
+              <w:bottom w:w="80" w:type="dxa"/>
+              <w:right w:w="120" w:type="dxa"/>
+            </w:tcMar>
+          </w:tcPr>
+          <w:p>
+            <w:r>
+              <w:rPr>
+                <w:sz w:val="20"/>
+                <w:szCs w:val="20"/>
+              </w:rPr>
+              <w:t>Will be able to plan less crowded journeys and save time.</w:t>
+            </w:r>
+          </w:p>
+        </w:tc>
+      </w:tr>
+      <w:tr>
+        <w:trPr>
+          <w:trHeight w:val="707"/>
+        </w:trPr>
+        <w:tc>
+          <w:tcPr>
+            <w:tcW w:w="3280" w:type="dxa"/>
+            <w:tcBorders>
+              <w:top w:val="single" w:sz="1" w:space="0" w:color="CCCCCC"/>
+              <w:left w:val="single" w:sz="1" w:space="0" w:color="CCCCCC"/>
+              <w:bottom w:val="single" w:sz="1" w:space="0" w:color="CCCCCC"/>
+              <w:right w:val="single" w:sz="1" w:space="0" w:color="CCCCCC"/>
+            </w:tcBorders>
+            <w:shd w:val="clear" w:color="auto" w:fill="EBF3FB"/>
+            <w:tcMar>
+              <w:top w:w="80" w:type="dxa"/>
+              <w:left w:w="120" w:type="dxa"/>
+              <w:bottom w:w="80" w:type="dxa"/>
+              <w:right w:w="120" w:type="dxa"/>
+            </w:tcMar>
+          </w:tcPr>
+          <w:p>
+            <w:r>
+              <w:rPr>
+                <w:sz w:val="20"/>
+                <w:szCs w:val="20"/>
+              </w:rPr>
+              <w:t>City Planners</w:t>
+            </w:r>
+          </w:p>
+        </w:tc>
+        <w:tc>
+          <w:tcPr>
+            <w:tcW w:w="5971" w:type="dxa"/>
+            <w:tcBorders>
+              <w:top w:val="single" w:sz="1" w:space="0" w:color="CCCCCC"/>
+              <w:left w:val="single" w:sz="1" w:space="0" w:color="CCCCCC"/>
+              <w:bottom w:val="single" w:sz="1" w:space="0" w:color="CCCCCC"/>
+              <w:right w:val="single" w:sz="1" w:space="0" w:color="CCCCCC"/>
+            </w:tcBorders>
+            <w:shd w:val="clear" w:color="auto" w:fill="EBF3FB"/>
+            <w:tcMar>
+              <w:top w:w="80" w:type="dxa"/>
+              <w:left w:w="120" w:type="dxa"/>
+              <w:bottom w:w="80" w:type="dxa"/>
+              <w:right w:w="120" w:type="dxa"/>
+            </w:tcMar>
+          </w:tcPr>
+          <w:p>
+            <w:r>
+              <w:rPr>
+                <w:sz w:val="20"/>
+                <w:szCs w:val="20"/>
+              </w:rPr>
+              <w:t>Understand peak demand patterns to i</w:t>
+            </w:r>
+            <w:r>
+              <w:rPr>
+                <w:sz w:val="20"/>
+                <w:szCs w:val="20"/>
+              </w:rPr>
+              <w:t>mprove</w:t>
+            </w:r>
+            <w:r>
+              <w:rPr>
+                <w:sz w:val="20"/>
+                <w:szCs w:val="20"/>
+              </w:rPr>
+              <w:t xml:space="preserve"> infrastructure decisions</w:t>
+            </w:r>
+            <w:r>
+              <w:rPr>
+                <w:sz w:val="20"/>
+                <w:szCs w:val="20"/>
+              </w:rPr>
+              <w:t>.</w:t>
+            </w:r>
+          </w:p>
+        </w:tc>
+      </w:tr>
+      <w:tr>
+        <w:trPr>
+          <w:trHeight w:val="935"/>
+        </w:trPr>
+        <w:tc>
+          <w:tcPr>
+            <w:tcW w:w="3280" w:type="dxa"/>
+            <w:tcBorders>
+              <w:top w:val="single" w:sz="1" w:space="0" w:color="CCCCCC"/>
+              <w:left w:val="single" w:sz="1" w:space="0" w:color="CCCCCC"/>
+              <w:bottom w:val="single" w:sz="1" w:space="0" w:color="CCCCCC"/>
+              <w:right w:val="single" w:sz="1" w:space="0" w:color="CCCCCC"/>
+            </w:tcBorders>
+            <w:shd w:val="clear" w:color="auto" w:fill="FFFFFF"/>
+            <w:tcMar>
+              <w:top w:w="80" w:type="dxa"/>
+              <w:left w:w="120" w:type="dxa"/>
+              <w:bottom w:w="80" w:type="dxa"/>
+              <w:right w:w="120" w:type="dxa"/>
+            </w:tcMar>
+          </w:tcPr>
+          <w:p>
+            <w:r>
+              <w:rPr>
+                <w:sz w:val="20"/>
+                <w:szCs w:val="20"/>
+              </w:rPr>
               <w:t>Station Managers</w:t>
             </w:r>
           </w:p>
         </w:tc>
         <w:tc>
           <w:tcPr>
-            <w:tcW w:w="5826" w:type="dxa"/>
+            <w:tcW w:w="5971" w:type="dxa"/>
             <w:tcBorders>
               <w:top w:val="single" w:sz="1" w:space="0" w:color="CCCCCC"/>
               <w:left w:val="single" w:sz="1" w:space="0" w:color="CCCCCC"/>
@@ -1205,21 +1219,6 @@
     </w:p>
     <w:p>
       <w:pPr>
-        <w:spacing w:before="60" w:after="60"/>
-      </w:pPr>
-    </w:p>
-    <w:p>
-      <w:pPr>
-        <w:spacing w:before="60" w:after="60"/>
-      </w:pPr>
-    </w:p>
-    <w:p>
-      <w:pPr>
-        <w:spacing w:before="60" w:after="60"/>
-      </w:pPr>
-    </w:p>
-    <w:p>
-      <w:pPr>
         <w:pStyle w:val="Heading2"/>
       </w:pPr>
       <w:r>
@@ -1257,7 +1256,7 @@
     </w:p>
     <w:tbl>
       <w:tblPr>
-        <w:tblW w:w="9194" w:type="dxa"/>
+        <w:tblW w:w="9060" w:type="dxa"/>
         <w:tblBorders>
           <w:top w:val="single" w:sz="4" w:space="0" w:color="auto"/>
           <w:left w:val="single" w:sz="4" w:space="0" w:color="auto"/>
@@ -1273,16 +1272,16 @@
         <w:tblLook w:val="04A0" w:firstRow="1" w:lastRow="0" w:firstColumn="1" w:lastColumn="0" w:noHBand="0" w:noVBand="1"/>
       </w:tblPr>
       <w:tblGrid>
-        <w:gridCol w:w="3667"/>
-        <w:gridCol w:w="5527"/>
+        <w:gridCol w:w="3614"/>
+        <w:gridCol w:w="5446"/>
       </w:tblGrid>
       <w:tr>
         <w:trPr>
-          <w:trHeight w:val="258"/>
+          <w:trHeight w:val="474"/>
         </w:trPr>
         <w:tc>
           <w:tcPr>
-            <w:tcW w:w="3667" w:type="dxa"/>
+            <w:tcW w:w="3614" w:type="dxa"/>
             <w:tcBorders>
               <w:top w:val="single" w:sz="1" w:space="0" w:color="CCCCCC"/>
               <w:left w:val="single" w:sz="1" w:space="0" w:color="CCCCCC"/>
@@ -1312,7 +1311,7 @@
         </w:tc>
         <w:tc>
           <w:tcPr>
-            <w:tcW w:w="5527" w:type="dxa"/>
+            <w:tcW w:w="5446" w:type="dxa"/>
             <w:tcBorders>
               <w:top w:val="single" w:sz="1" w:space="0" w:color="CCCCCC"/>
               <w:left w:val="single" w:sz="1" w:space="0" w:color="CCCCCC"/>
@@ -1343,11 +1342,11 @@
       </w:tr>
       <w:tr>
         <w:trPr>
-          <w:trHeight w:val="245"/>
+          <w:trHeight w:val="451"/>
         </w:trPr>
         <w:tc>
           <w:tcPr>
-            <w:tcW w:w="3667" w:type="dxa"/>
+            <w:tcW w:w="3614" w:type="dxa"/>
             <w:tcBorders>
               <w:top w:val="single" w:sz="1" w:space="0" w:color="CCCCCC"/>
               <w:left w:val="single" w:sz="1" w:space="0" w:color="CCCCCC"/>
@@ -1374,7 +1373,7 @@
         </w:tc>
         <w:tc>
           <w:tcPr>
-            <w:tcW w:w="5527" w:type="dxa"/>
+            <w:tcW w:w="5446" w:type="dxa"/>
             <w:tcBorders>
               <w:top w:val="single" w:sz="1" w:space="0" w:color="CCCCCC"/>
               <w:left w:val="single" w:sz="1" w:space="0" w:color="CCCCCC"/>
@@ -1402,11 +1401,11 @@
       </w:tr>
       <w:tr>
         <w:trPr>
-          <w:trHeight w:val="258"/>
+          <w:trHeight w:val="474"/>
         </w:trPr>
         <w:tc>
           <w:tcPr>
-            <w:tcW w:w="3667" w:type="dxa"/>
+            <w:tcW w:w="3614" w:type="dxa"/>
             <w:tcBorders>
               <w:top w:val="single" w:sz="1" w:space="0" w:color="CCCCCC"/>
               <w:left w:val="single" w:sz="1" w:space="0" w:color="CCCCCC"/>
@@ -1433,7 +1432,7 @@
         </w:tc>
         <w:tc>
           <w:tcPr>
-            <w:tcW w:w="5527" w:type="dxa"/>
+            <w:tcW w:w="5446" w:type="dxa"/>
             <w:tcBorders>
               <w:top w:val="single" w:sz="1" w:space="0" w:color="CCCCCC"/>
               <w:left w:val="single" w:sz="1" w:space="0" w:color="CCCCCC"/>
@@ -1461,11 +1460,11 @@
       </w:tr>
       <w:tr>
         <w:trPr>
-          <w:trHeight w:val="258"/>
+          <w:trHeight w:val="474"/>
         </w:trPr>
         <w:tc>
           <w:tcPr>
-            <w:tcW w:w="3667" w:type="dxa"/>
+            <w:tcW w:w="3614" w:type="dxa"/>
             <w:tcBorders>
               <w:top w:val="single" w:sz="1" w:space="0" w:color="CCCCCC"/>
               <w:left w:val="single" w:sz="1" w:space="0" w:color="CCCCCC"/>
@@ -1492,7 +1491,7 @@
         </w:tc>
         <w:tc>
           <w:tcPr>
-            <w:tcW w:w="5527" w:type="dxa"/>
+            <w:tcW w:w="5446" w:type="dxa"/>
             <w:tcBorders>
               <w:top w:val="single" w:sz="1" w:space="0" w:color="CCCCCC"/>
               <w:left w:val="single" w:sz="1" w:space="0" w:color="CCCCCC"/>
@@ -1520,11 +1519,11 @@
       </w:tr>
       <w:tr>
         <w:trPr>
-          <w:trHeight w:val="245"/>
+          <w:trHeight w:val="451"/>
         </w:trPr>
         <w:tc>
           <w:tcPr>
-            <w:tcW w:w="3667" w:type="dxa"/>
+            <w:tcW w:w="3614" w:type="dxa"/>
             <w:tcBorders>
               <w:top w:val="single" w:sz="1" w:space="0" w:color="CCCCCC"/>
               <w:left w:val="single" w:sz="1" w:space="0" w:color="CCCCCC"/>
@@ -1551,7 +1550,7 @@
         </w:tc>
         <w:tc>
           <w:tcPr>
-            <w:tcW w:w="5527" w:type="dxa"/>
+            <w:tcW w:w="5446" w:type="dxa"/>
             <w:tcBorders>
               <w:top w:val="single" w:sz="1" w:space="0" w:color="CCCCCC"/>
               <w:left w:val="single" w:sz="1" w:space="0" w:color="CCCCCC"/>
@@ -1807,6 +1806,8 @@
             </w:tcMar>
           </w:tcPr>
           <w:p>
+            <w:proofErr w:type="spellStart"/>
+            <w:proofErr w:type="gramStart"/>
             <w:r>
               <w:rPr>
                 <w:sz w:val="20"/>
@@ -1814,6 +1815,8 @@
               </w:rPr>
               <w:t>Node.Seq.Order</w:t>
             </w:r>
+            <w:proofErr w:type="spellEnd"/>
+            <w:proofErr w:type="gramEnd"/>
           </w:p>
         </w:tc>
         <w:tc>
@@ -1973,6 +1976,7 @@
             </w:tcMar>
           </w:tcPr>
           <w:p>
+            <w:proofErr w:type="spellStart"/>
             <w:r>
               <w:rPr>
                 <w:sz w:val="20"/>
@@ -1980,6 +1984,7 @@
               </w:rPr>
               <w:t>Segment.Direction</w:t>
             </w:r>
+            <w:proofErr w:type="spellEnd"/>
           </w:p>
         </w:tc>
         <w:tc>
@@ -2056,6 +2061,7 @@
             </w:tcMar>
           </w:tcPr>
           <w:p>
+            <w:proofErr w:type="spellStart"/>
             <w:r>
               <w:rPr>
                 <w:sz w:val="20"/>
@@ -2063,6 +2069,7 @@
               </w:rPr>
               <w:t>Service.Line</w:t>
             </w:r>
+            <w:proofErr w:type="spellEnd"/>
           </w:p>
         </w:tc>
         <w:tc>
@@ -2247,7 +2254,43 @@
         <w:jc w:val="both"/>
       </w:pPr>
       <w:r>
-        <w:t>An initial inspection using df.isnull().sum() and df.duplicated().sum() revealed the presence of both missing values and duplicate rows. The exact counts are detailed below:</w:t>
+        <w:t xml:space="preserve">An initial inspection using </w:t>
+      </w:r>
+      <w:proofErr w:type="spellStart"/>
+      <w:proofErr w:type="gramStart"/>
+      <w:r>
+        <w:t>df.isnull</w:t>
+      </w:r>
+      <w:proofErr w:type="spellEnd"/>
+      <w:proofErr w:type="gramEnd"/>
+      <w:r>
+        <w:t>(</w:t>
+      </w:r>
+      <w:proofErr w:type="gramStart"/>
+      <w:r>
+        <w:t>).sum</w:t>
+      </w:r>
+      <w:proofErr w:type="gramEnd"/>
+      <w:r>
+        <w:t xml:space="preserve">() and </w:t>
+      </w:r>
+      <w:proofErr w:type="spellStart"/>
+      <w:proofErr w:type="gramStart"/>
+      <w:r>
+        <w:t>df.duplicated</w:t>
+      </w:r>
+      <w:proofErr w:type="spellEnd"/>
+      <w:proofErr w:type="gramEnd"/>
+      <w:r>
+        <w:t>(</w:t>
+      </w:r>
+      <w:proofErr w:type="gramStart"/>
+      <w:r>
+        <w:t>).sum</w:t>
+      </w:r>
+      <w:proofErr w:type="gramEnd"/>
+      <w:r>
+        <w:t>() revealed the presence of both missing values and duplicate rows. The exact counts are detailed below:</w:t>
       </w:r>
     </w:p>
     <w:p>
@@ -2453,7 +2496,25 @@
                 <w:sz w:val="20"/>
                 <w:szCs w:val="20"/>
               </w:rPr>
-              <w:t>Rows with missing values dropped using df.dropna()</w:t>
+              <w:t xml:space="preserve">Rows with missing values dropped using </w:t>
+            </w:r>
+            <w:proofErr w:type="spellStart"/>
+            <w:proofErr w:type="gramStart"/>
+            <w:r>
+              <w:rPr>
+                <w:sz w:val="20"/>
+                <w:szCs w:val="20"/>
+              </w:rPr>
+              <w:t>df.dropna</w:t>
+            </w:r>
+            <w:proofErr w:type="spellEnd"/>
+            <w:proofErr w:type="gramEnd"/>
+            <w:r>
+              <w:rPr>
+                <w:sz w:val="20"/>
+                <w:szCs w:val="20"/>
+              </w:rPr>
+              <w:t>()</w:t>
             </w:r>
           </w:p>
         </w:tc>
@@ -2539,7 +2600,48 @@
                 <w:sz w:val="20"/>
                 <w:szCs w:val="20"/>
               </w:rPr>
-              <w:t>Removed using df.drop_duplicates()</w:t>
+              <w:t xml:space="preserve">Removed using </w:t>
+            </w:r>
+            <w:proofErr w:type="spellStart"/>
+            <w:proofErr w:type="gramStart"/>
+            <w:r>
+              <w:rPr>
+                <w:sz w:val="20"/>
+                <w:szCs w:val="20"/>
+              </w:rPr>
+              <w:t>df.drop</w:t>
+            </w:r>
+            <w:proofErr w:type="gramEnd"/>
+            <w:r>
+              <w:rPr>
+                <w:sz w:val="20"/>
+                <w:szCs w:val="20"/>
+              </w:rPr>
+              <w:t>_</w:t>
+            </w:r>
+            <w:proofErr w:type="gramStart"/>
+            <w:r>
+              <w:rPr>
+                <w:sz w:val="20"/>
+                <w:szCs w:val="20"/>
+              </w:rPr>
+              <w:t>duplicates</w:t>
+            </w:r>
+            <w:proofErr w:type="spellEnd"/>
+            <w:r>
+              <w:rPr>
+                <w:sz w:val="20"/>
+                <w:szCs w:val="20"/>
+              </w:rPr>
+              <w:t>(</w:t>
+            </w:r>
+            <w:proofErr w:type="gramEnd"/>
+            <w:r>
+              <w:rPr>
+                <w:sz w:val="20"/>
+                <w:szCs w:val="20"/>
+              </w:rPr>
+              <w:t>)</w:t>
             </w:r>
           </w:p>
         </w:tc>
@@ -2631,21 +2733,7 @@
         </w:tc>
       </w:tr>
     </w:tbl>
-    <w:p>
-      <w:pPr>
-        <w:spacing w:before="60" w:after="60"/>
-      </w:pPr>
-    </w:p>
-    <w:p>
-      <w:pPr>
-        <w:pStyle w:val="Heading3"/>
-      </w:pPr>
-    </w:p>
-    <w:p>
-      <w:pPr>
-        <w:pStyle w:val="Heading3"/>
-      </w:pPr>
-    </w:p>
+    <w:p/>
     <w:p>
       <w:pPr>
         <w:pStyle w:val="Heading3"/>
@@ -2698,8 +2786,13 @@
         </w:numPr>
         <w:spacing w:before="40" w:after="40"/>
       </w:pPr>
-      <w:r>
-        <w:t>Segment.Direction:</w:t>
+      <w:proofErr w:type="spellStart"/>
+      <w:r>
+        <w:t>Segment.Direction</w:t>
+      </w:r>
+      <w:proofErr w:type="spellEnd"/>
+      <w:r>
+        <w:t>:</w:t>
       </w:r>
       <w:r>
         <w:t xml:space="preserve"> When analyzed it was found that it had 4 unique values in the raw data when in reality only 2 directions existed in the dataset.</w:t>
@@ -2720,8 +2813,13 @@
         </w:numPr>
         <w:spacing w:before="40" w:after="40"/>
       </w:pPr>
-      <w:r>
-        <w:t>Service.Line: M</w:t>
+      <w:proofErr w:type="spellStart"/>
+      <w:r>
+        <w:t>Service.Line</w:t>
+      </w:r>
+      <w:proofErr w:type="spellEnd"/>
+      <w:r>
+        <w:t>: M</w:t>
       </w:r>
       <w:r>
         <w:t>ultiple</w:t>
@@ -2806,12 +2904,21 @@
         </w:rPr>
         <w:t xml:space="preserve">&amp; </w:t>
       </w:r>
+      <w:proofErr w:type="spellStart"/>
       <w:r>
         <w:rPr>
           <w:b/>
           <w:bCs/>
         </w:rPr>
-        <w:t>Segment.Direction) were discovered iteratively during EDA and fixed retroactively, as noted in the notebook.</w:t>
+        <w:t>Segment.Direction</w:t>
+      </w:r>
+      <w:proofErr w:type="spellEnd"/>
+      <w:r>
+        <w:rPr>
+          <w:b/>
+          <w:bCs/>
+        </w:rPr>
+        <w:t>) were discovered iteratively during EDA and fixed retroactively, as noted in the notebook.</w:t>
       </w:r>
       <w:r>
         <w:rPr>
@@ -3052,7 +3159,25 @@
                 <w:sz w:val="20"/>
                 <w:szCs w:val="20"/>
               </w:rPr>
-              <w:t>Dropped rows using df.dropna()</w:t>
+              <w:t xml:space="preserve">Dropped rows using </w:t>
+            </w:r>
+            <w:proofErr w:type="spellStart"/>
+            <w:proofErr w:type="gramStart"/>
+            <w:r>
+              <w:rPr>
+                <w:sz w:val="20"/>
+                <w:szCs w:val="20"/>
+              </w:rPr>
+              <w:t>df.dropna</w:t>
+            </w:r>
+            <w:proofErr w:type="spellEnd"/>
+            <w:proofErr w:type="gramEnd"/>
+            <w:r>
+              <w:rPr>
+                <w:sz w:val="20"/>
+                <w:szCs w:val="20"/>
+              </w:rPr>
+              <w:t>()</w:t>
             </w:r>
           </w:p>
         </w:tc>
@@ -3239,7 +3364,48 @@
                 <w:sz w:val="20"/>
                 <w:szCs w:val="20"/>
               </w:rPr>
-              <w:t>Removed using df.drop_duplicates()</w:t>
+              <w:t xml:space="preserve">Removed using </w:t>
+            </w:r>
+            <w:proofErr w:type="spellStart"/>
+            <w:proofErr w:type="gramStart"/>
+            <w:r>
+              <w:rPr>
+                <w:sz w:val="20"/>
+                <w:szCs w:val="20"/>
+              </w:rPr>
+              <w:t>df.drop</w:t>
+            </w:r>
+            <w:proofErr w:type="gramEnd"/>
+            <w:r>
+              <w:rPr>
+                <w:sz w:val="20"/>
+                <w:szCs w:val="20"/>
+              </w:rPr>
+              <w:t>_</w:t>
+            </w:r>
+            <w:proofErr w:type="gramStart"/>
+            <w:r>
+              <w:rPr>
+                <w:sz w:val="20"/>
+                <w:szCs w:val="20"/>
+              </w:rPr>
+              <w:t>duplicates</w:t>
+            </w:r>
+            <w:proofErr w:type="spellEnd"/>
+            <w:r>
+              <w:rPr>
+                <w:sz w:val="20"/>
+                <w:szCs w:val="20"/>
+              </w:rPr>
+              <w:t>(</w:t>
+            </w:r>
+            <w:proofErr w:type="gramEnd"/>
+            <w:r>
+              <w:rPr>
+                <w:sz w:val="20"/>
+                <w:szCs w:val="20"/>
+              </w:rPr>
+              <w:t>)</w:t>
             </w:r>
           </w:p>
         </w:tc>
@@ -3358,12 +3524,39 @@
             </w:tcMar>
           </w:tcPr>
           <w:p>
-            <w:r>
-              <w:rPr>
-                <w:sz w:val="20"/>
-                <w:szCs w:val="20"/>
-              </w:rPr>
-              <w:t>Standardised to uppercase using str.upper()</w:t>
+            <w:proofErr w:type="spellStart"/>
+            <w:r>
+              <w:rPr>
+                <w:sz w:val="20"/>
+                <w:szCs w:val="20"/>
+              </w:rPr>
+              <w:t>Standardised</w:t>
+            </w:r>
+            <w:proofErr w:type="spellEnd"/>
+            <w:r>
+              <w:rPr>
+                <w:sz w:val="20"/>
+                <w:szCs w:val="20"/>
+              </w:rPr>
+              <w:t xml:space="preserve"> to uppercase using </w:t>
+            </w:r>
+            <w:proofErr w:type="spellStart"/>
+            <w:proofErr w:type="gramStart"/>
+            <w:r>
+              <w:rPr>
+                <w:sz w:val="20"/>
+                <w:szCs w:val="20"/>
+              </w:rPr>
+              <w:t>str.upper</w:t>
+            </w:r>
+            <w:proofErr w:type="spellEnd"/>
+            <w:proofErr w:type="gramEnd"/>
+            <w:r>
+              <w:rPr>
+                <w:sz w:val="20"/>
+                <w:szCs w:val="20"/>
+              </w:rPr>
+              <w:t>()</w:t>
             </w:r>
           </w:p>
         </w:tc>
@@ -3480,7 +3673,25 @@
                 <w:sz w:val="20"/>
                 <w:szCs w:val="20"/>
               </w:rPr>
-              <w:t>Replaced using df.replace()</w:t>
+              <w:t xml:space="preserve">Replaced using </w:t>
+            </w:r>
+            <w:proofErr w:type="spellStart"/>
+            <w:proofErr w:type="gramStart"/>
+            <w:r>
+              <w:rPr>
+                <w:sz w:val="20"/>
+                <w:szCs w:val="20"/>
+              </w:rPr>
+              <w:t>df.replace</w:t>
+            </w:r>
+            <w:proofErr w:type="spellEnd"/>
+            <w:proofErr w:type="gramEnd"/>
+            <w:r>
+              <w:rPr>
+                <w:sz w:val="20"/>
+                <w:szCs w:val="20"/>
+              </w:rPr>
+              <w:t>()</w:t>
             </w:r>
           </w:p>
         </w:tc>
@@ -3590,7 +3801,25 @@
                 <w:sz w:val="20"/>
                 <w:szCs w:val="20"/>
               </w:rPr>
-              <w:t>Replaced using df.replace()</w:t>
+              <w:t xml:space="preserve">Replaced using </w:t>
+            </w:r>
+            <w:proofErr w:type="spellStart"/>
+            <w:proofErr w:type="gramStart"/>
+            <w:r>
+              <w:rPr>
+                <w:sz w:val="20"/>
+                <w:szCs w:val="20"/>
+              </w:rPr>
+              <w:t>df.replace</w:t>
+            </w:r>
+            <w:proofErr w:type="spellEnd"/>
+            <w:proofErr w:type="gramEnd"/>
+            <w:r>
+              <w:rPr>
+                <w:sz w:val="20"/>
+                <w:szCs w:val="20"/>
+              </w:rPr>
+              <w:t>()</w:t>
             </w:r>
           </w:p>
         </w:tc>
@@ -3682,6 +3911,7 @@
             </w:tcMar>
           </w:tcPr>
           <w:p>
+            <w:proofErr w:type="spellStart"/>
             <w:r>
               <w:rPr>
                 <w:sz w:val="20"/>
@@ -3689,6 +3919,7 @@
               </w:rPr>
               <w:t>Segment.Direction</w:t>
             </w:r>
+            <w:proofErr w:type="spellEnd"/>
           </w:p>
         </w:tc>
         <w:tc>
@@ -3714,7 +3945,25 @@
                 <w:sz w:val="20"/>
                 <w:szCs w:val="20"/>
               </w:rPr>
-              <w:t>Stripped using str.strip()</w:t>
+              <w:t xml:space="preserve">Stripped using </w:t>
+            </w:r>
+            <w:proofErr w:type="spellStart"/>
+            <w:proofErr w:type="gramStart"/>
+            <w:r>
+              <w:rPr>
+                <w:sz w:val="20"/>
+                <w:szCs w:val="20"/>
+              </w:rPr>
+              <w:t>str.strip</w:t>
+            </w:r>
+            <w:proofErr w:type="spellEnd"/>
+            <w:proofErr w:type="gramEnd"/>
+            <w:r>
+              <w:rPr>
+                <w:sz w:val="20"/>
+                <w:szCs w:val="20"/>
+              </w:rPr>
+              <w:t>()</w:t>
             </w:r>
           </w:p>
         </w:tc>
@@ -3772,17 +4021,266 @@
     <w:p>
       <w:pPr>
         <w:spacing w:before="60" w:after="60"/>
+        <w:jc w:val="center"/>
+      </w:pPr>
+    </w:p>
+    <w:p>
+      <w:pPr>
+        <w:spacing w:before="60" w:after="60"/>
+        <w:jc w:val="both"/>
+      </w:pPr>
+      <w:r>
+        <w:rPr>
+          <w:b/>
+          <w:bCs/>
+        </w:rPr>
+        <w:t>Insight on missing and duplicate values</w:t>
+      </w:r>
+      <w:r>
+        <w:t xml:space="preserve">: Upon thorough inspection of the dataset, the total missing values and duplicate rows were calculated to be 522 and 250. </w:t>
+      </w:r>
+    </w:p>
+    <w:p>
+      <w:pPr>
+        <w:spacing w:before="60" w:after="60"/>
+      </w:pPr>
+    </w:p>
+    <w:p>
+      <w:pPr>
+        <w:spacing w:before="60" w:after="60"/>
+        <w:jc w:val="both"/>
+      </w:pPr>
+      <w:r>
+        <w:t>This implies approximately 49,478 rows are expected after cleaning. However, the actual count came out to 49,482 rows, suggesting some rows had both missing values and duplicates simultaneously</w:t>
+      </w:r>
+      <w:r>
+        <w:t xml:space="preserve">. </w:t>
+      </w:r>
+    </w:p>
+    <w:p>
+      <w:pPr>
+        <w:spacing w:before="60" w:after="60"/>
+      </w:pPr>
+    </w:p>
+    <w:p>
+      <w:pPr>
+        <w:pStyle w:val="Heading3"/>
+      </w:pPr>
+      <w:r>
+        <w:t>3.2 Data After Cleaning</w:t>
+      </w:r>
+    </w:p>
+    <w:p>
+      <w:pPr>
+        <w:jc w:val="both"/>
+      </w:pPr>
+      <w:r>
+        <w:t xml:space="preserve">After applying all cleaning </w:t>
+      </w:r>
+      <w:r>
+        <w:t>processes,</w:t>
+      </w:r>
+      <w:r>
+        <w:t xml:space="preserve"> the dataset was verified and </w:t>
+      </w:r>
+      <w:r>
+        <w:t xml:space="preserve">saved </w:t>
+      </w:r>
+      <w:r>
+        <w:t>as train_occupancy_cleaned.csv</w:t>
+      </w:r>
+      <w:r>
+        <w:t>. The final cleaned dataset had no missing values</w:t>
+      </w:r>
+      <w:r>
+        <w:t>,</w:t>
+      </w:r>
+      <w:r>
+        <w:t xml:space="preserve"> no duplicate rows</w:t>
+      </w:r>
+      <w:r>
+        <w:t>,</w:t>
+      </w:r>
+      <w:r>
+        <w:t xml:space="preserve"> and ready for EDA and future modelling in Stage 2.</w:t>
+      </w:r>
+      <w:r>
+        <w:t xml:space="preserve"> However, note: some issues were discovered during EDA (please refer to section 3.1 for more information).</w:t>
+      </w:r>
+    </w:p>
+    <w:p>
+      <w:pPr>
+        <w:spacing w:before="60" w:after="60"/>
+      </w:pPr>
+    </w:p>
+    <w:p>
+      <w:pPr>
+        <w:pStyle w:val="Heading2"/>
+      </w:pPr>
+      <w:r>
+        <w:t>Step 4. Exploratory Data Analysis</w:t>
+      </w:r>
+    </w:p>
+    <w:p>
+      <w:pPr>
+        <w:jc w:val="both"/>
+      </w:pPr>
+      <w:r>
+        <w:t>Four features were selected for EDA</w:t>
+      </w:r>
+      <w:r>
+        <w:t xml:space="preserve">, </w:t>
+      </w:r>
+      <w:r>
+        <w:t xml:space="preserve">two categorical </w:t>
+      </w:r>
+      <w:r>
+        <w:t xml:space="preserve">attributes </w:t>
+      </w:r>
+      <w:r>
+        <w:t xml:space="preserve">(Occupancy Status, </w:t>
+      </w:r>
+      <w:proofErr w:type="spellStart"/>
+      <w:r>
+        <w:t>Segment.Direction</w:t>
+      </w:r>
+      <w:proofErr w:type="spellEnd"/>
+      <w:r>
+        <w:t>) and two numerical</w:t>
+      </w:r>
+      <w:r>
+        <w:t xml:space="preserve"> attributes</w:t>
+      </w:r>
+      <w:r>
+        <w:t xml:space="preserve"> (</w:t>
+      </w:r>
+      <w:proofErr w:type="spellStart"/>
+      <w:proofErr w:type="gramStart"/>
+      <w:r>
+        <w:t>Node.Seq.Order</w:t>
+      </w:r>
+      <w:proofErr w:type="spellEnd"/>
+      <w:proofErr w:type="gramEnd"/>
+      <w:r>
+        <w:t>, day)</w:t>
+      </w:r>
+      <w:r>
+        <w:t>. These were c</w:t>
+      </w:r>
+      <w:r>
+        <w:t xml:space="preserve">hosen </w:t>
+      </w:r>
+      <w:r>
+        <w:t xml:space="preserve">because of </w:t>
+      </w:r>
+      <w:r>
+        <w:t>their direct relevance to the research question defined in Step 1.</w:t>
+      </w:r>
+    </w:p>
+    <w:p>
+      <w:pPr>
+        <w:jc w:val="both"/>
+      </w:pPr>
+    </w:p>
+    <w:p>
+      <w:pPr>
+        <w:jc w:val="both"/>
+      </w:pPr>
+      <w:r>
+        <w:rPr>
+          <w:b/>
+          <w:bCs/>
+        </w:rPr>
+        <w:t>NOTE:</w:t>
+      </w:r>
+      <w:r>
+        <w:t xml:space="preserve"> Initially </w:t>
+      </w:r>
+      <w:proofErr w:type="spellStart"/>
+      <w:r>
+        <w:t>Service.Line</w:t>
+      </w:r>
+      <w:proofErr w:type="spellEnd"/>
+      <w:r>
+        <w:t xml:space="preserve"> attribute was considered for categorical feature 2, but due to the presence of a huge spectrum of unique categorical values for the attribute, </w:t>
+      </w:r>
+      <w:proofErr w:type="spellStart"/>
+      <w:r>
+        <w:t>Segment.Direction</w:t>
+      </w:r>
+      <w:proofErr w:type="spellEnd"/>
+      <w:r>
+        <w:t xml:space="preserve"> seemed to be a better option than </w:t>
+      </w:r>
+      <w:proofErr w:type="spellStart"/>
+      <w:r>
+        <w:t>Service.Line</w:t>
+      </w:r>
+      <w:proofErr w:type="spellEnd"/>
+      <w:r>
+        <w:t xml:space="preserve"> attribute since it only had 2 unique values upon cleaning of the trailing whitespaces in its values.</w:t>
+      </w:r>
+    </w:p>
+    <w:p>
+      <w:pPr>
+        <w:spacing w:before="60" w:after="60"/>
+      </w:pPr>
+    </w:p>
+    <w:p>
+      <w:pPr>
+        <w:pStyle w:val="Heading3"/>
+      </w:pPr>
+      <w:r>
+        <w:t xml:space="preserve">4.1 Categorical Feature </w:t>
+      </w:r>
+      <w:r>
+        <w:t xml:space="preserve">1: </w:t>
+      </w:r>
+      <w:r>
+        <w:t>Occupancy Status</w:t>
+      </w:r>
+    </w:p>
+    <w:p>
+      <w:pPr>
+        <w:spacing w:before="80" w:after="80"/>
+        <w:jc w:val="both"/>
+      </w:pPr>
+      <w:r>
+        <w:t xml:space="preserve">A bar chart was used to </w:t>
+      </w:r>
+      <w:r>
+        <w:t>visualize</w:t>
+      </w:r>
+      <w:r>
+        <w:t xml:space="preserve"> the distribution of occupancy categories, as bar charts are the standard method for comparing frequencies across distinct categorical groups.</w:t>
+      </w:r>
+    </w:p>
+    <w:p>
+      <w:pPr>
+        <w:spacing w:before="80" w:after="80"/>
+        <w:jc w:val="both"/>
+      </w:pPr>
+    </w:p>
+    <w:p>
+      <w:pPr>
+        <w:spacing w:before="80" w:after="40"/>
+        <w:jc w:val="center"/>
+      </w:pPr>
+    </w:p>
+    <w:p>
+      <w:pPr>
+        <w:spacing w:before="80" w:after="80"/>
+        <w:jc w:val="both"/>
       </w:pPr>
       <w:r>
         <w:rPr>
           <w:noProof/>
         </w:rPr>
-        <w:lastRenderedPageBreak/>
         <w:drawing>
-          <wp:inline distT="0" distB="0" distL="0" distR="0" wp14:anchorId="0134D6D4" wp14:editId="7D71655F">
-            <wp:extent cx="5731510" cy="2435225"/>
-            <wp:effectExtent l="0" t="0" r="2540" b="3175"/>
-            <wp:docPr id="1729772256" name="Picture 1"/>
+          <wp:inline distT="0" distB="0" distL="0" distR="0" wp14:anchorId="26ACF992" wp14:editId="6C3BA534">
+            <wp:extent cx="5731510" cy="2832735"/>
+            <wp:effectExtent l="0" t="0" r="2540" b="5715"/>
+            <wp:docPr id="269771276" name="Picture 1"/>
             <wp:cNvGraphicFramePr>
               <a:graphicFrameLocks xmlns:a="http://schemas.openxmlformats.org/drawingml/2006/main" noChangeAspect="1"/>
             </wp:cNvGraphicFramePr>
@@ -3790,1226 +4288,11 @@
               <a:graphicData uri="http://schemas.openxmlformats.org/drawingml/2006/picture">
                 <pic:pic xmlns:pic="http://schemas.openxmlformats.org/drawingml/2006/picture">
                   <pic:nvPicPr>
-                    <pic:cNvPr id="1729772256" name=""/>
+                    <pic:cNvPr id="269771276" name="Picture 269771276"/>
                     <pic:cNvPicPr/>
                   </pic:nvPicPr>
                   <pic:blipFill>
-                    <a:blip r:embed="rId6"/>
-                    <a:stretch>
-                      <a:fillRect/>
-                    </a:stretch>
-                  </pic:blipFill>
-                  <pic:spPr>
-                    <a:xfrm>
-                      <a:off x="0" y="0"/>
-                      <a:ext cx="5731510" cy="2435225"/>
-                    </a:xfrm>
-                    <a:prstGeom prst="rect">
-                      <a:avLst/>
-                    </a:prstGeom>
-                  </pic:spPr>
-                </pic:pic>
-              </a:graphicData>
-            </a:graphic>
-          </wp:inline>
-        </w:drawing>
-      </w:r>
-    </w:p>
-    <w:p>
-      <w:pPr>
-        <w:spacing w:before="60" w:after="60"/>
-        <w:jc w:val="center"/>
-        <w:rPr>
-          <w:i/>
-          <w:iCs/>
-        </w:rPr>
-      </w:pPr>
-      <w:r>
-        <w:rPr>
-          <w:i/>
-          <w:iCs/>
-        </w:rPr>
-        <w:t>Figure 1: Missing values and duplicate rows removed using appropriate functions.</w:t>
-      </w:r>
-    </w:p>
-    <w:p>
-      <w:pPr>
-        <w:spacing w:before="60" w:after="60"/>
-        <w:jc w:val="center"/>
-      </w:pPr>
-    </w:p>
-    <w:p>
-      <w:pPr>
-        <w:spacing w:before="60" w:after="60"/>
-        <w:jc w:val="center"/>
-      </w:pPr>
-    </w:p>
-    <w:p>
-      <w:pPr>
-        <w:spacing w:before="60" w:after="60"/>
-        <w:jc w:val="both"/>
-      </w:pPr>
-      <w:r>
-        <w:rPr>
-          <w:b/>
-          <w:bCs/>
-        </w:rPr>
-        <w:t>Insight on missing and duplicate values</w:t>
-      </w:r>
-      <w:r>
-        <w:t xml:space="preserve">: Upon thorough inspection of the dataset, the total missing values and duplicate rows were calculated to be 522 and 250. </w:t>
-      </w:r>
-    </w:p>
-    <w:p>
-      <w:pPr>
-        <w:spacing w:before="60" w:after="60"/>
-      </w:pPr>
-    </w:p>
-    <w:p>
-      <w:pPr>
-        <w:spacing w:before="60" w:after="60"/>
-        <w:jc w:val="both"/>
-      </w:pPr>
-      <w:r>
-        <w:t>This implies approximately 49,478 rows are expected after cleaning. However, the actual count came out to 49,482 rows, suggesting some rows had both missing values and duplicates simultaneously</w:t>
-      </w:r>
-      <w:r>
-        <w:t xml:space="preserve">. </w:t>
-      </w:r>
-    </w:p>
-    <w:p>
-      <w:pPr>
-        <w:spacing w:before="60" w:after="60"/>
-      </w:pPr>
-    </w:p>
-    <w:p>
-      <w:pPr>
-        <w:pStyle w:val="Heading3"/>
-      </w:pPr>
-      <w:r>
-        <w:t>3.2 Data After Cleaning</w:t>
-      </w:r>
-    </w:p>
-    <w:p>
-      <w:pPr>
-        <w:jc w:val="both"/>
-      </w:pPr>
-      <w:r>
-        <w:t xml:space="preserve">After applying all cleaning </w:t>
-      </w:r>
-      <w:r>
-        <w:t>processes,</w:t>
-      </w:r>
-      <w:r>
-        <w:t xml:space="preserve"> the dataset was verified and </w:t>
-      </w:r>
-      <w:r>
-        <w:t xml:space="preserve">saved </w:t>
-      </w:r>
-      <w:r>
-        <w:t>as train_occupancy_cleaned.csv</w:t>
-      </w:r>
-      <w:r>
-        <w:t>. The final cleaned dataset had no missing values</w:t>
-      </w:r>
-      <w:r>
-        <w:t>,</w:t>
-      </w:r>
-      <w:r>
-        <w:t xml:space="preserve"> no duplicate rows</w:t>
-      </w:r>
-      <w:r>
-        <w:t>,</w:t>
-      </w:r>
-      <w:r>
-        <w:t xml:space="preserve"> and ready for EDA and future modelling in Stage 2.</w:t>
-      </w:r>
-      <w:r>
-        <w:t xml:space="preserve"> However, note: some issues were discovered during EDA (please refer to section 3.1 for more information).</w:t>
-      </w:r>
-    </w:p>
-    <w:p>
-      <w:pPr>
-        <w:spacing w:before="60" w:after="60"/>
-      </w:pPr>
-    </w:p>
-    <w:p>
-      <w:pPr>
-        <w:pStyle w:val="Heading2"/>
-      </w:pPr>
-      <w:r>
-        <w:t>Step 4. Exploratory Data Analysis</w:t>
-      </w:r>
-    </w:p>
-    <w:p>
-      <w:pPr>
-        <w:jc w:val="both"/>
-      </w:pPr>
-      <w:r>
-        <w:t>Four features were selected for EDA</w:t>
-      </w:r>
-      <w:r>
-        <w:t xml:space="preserve">, </w:t>
-      </w:r>
-      <w:r>
-        <w:t xml:space="preserve">two categorical </w:t>
-      </w:r>
-      <w:r>
-        <w:t xml:space="preserve">attributes </w:t>
-      </w:r>
-      <w:r>
-        <w:t>(Occupancy Status, Segment.Direction) and two numerical</w:t>
-      </w:r>
-      <w:r>
-        <w:t xml:space="preserve"> attributes</w:t>
-      </w:r>
-      <w:r>
-        <w:t xml:space="preserve"> (Node.Seq.Order, day)</w:t>
-      </w:r>
-      <w:r>
-        <w:t>. These were c</w:t>
-      </w:r>
-      <w:r>
-        <w:t xml:space="preserve">hosen </w:t>
-      </w:r>
-      <w:r>
-        <w:t xml:space="preserve">because of </w:t>
-      </w:r>
-      <w:r>
-        <w:t>their direct relevance to the research question defined in Step 1.</w:t>
-      </w:r>
-    </w:p>
-    <w:p>
-      <w:pPr>
-        <w:jc w:val="both"/>
-      </w:pPr>
-    </w:p>
-    <w:p>
-      <w:pPr>
-        <w:jc w:val="both"/>
-      </w:pPr>
-      <w:r>
-        <w:rPr>
-          <w:b/>
-          <w:bCs/>
-        </w:rPr>
-        <w:t>NOTE:</w:t>
-      </w:r>
-      <w:r>
-        <w:t xml:space="preserve"> Initially Service.Line attribute was considered for categorical feature 2, but due to the presence of a huge spectrum of unique categorical values for the attribute, Segment.Direction seemed to be a better option than Service.Line attribute since it only had 2 unique values upon cleaning of the trailing whitespaces in its values.</w:t>
-      </w:r>
-    </w:p>
-    <w:p>
-      <w:pPr>
-        <w:jc w:val="both"/>
-      </w:pPr>
-    </w:p>
-    <w:p>
-      <w:pPr>
-        <w:jc w:val="both"/>
-      </w:pPr>
-    </w:p>
-    <w:p>
-      <w:pPr>
-        <w:jc w:val="both"/>
-      </w:pPr>
-    </w:p>
-    <w:p>
-      <w:pPr>
-        <w:jc w:val="both"/>
-      </w:pPr>
-    </w:p>
-    <w:p>
-      <w:pPr>
-        <w:jc w:val="both"/>
-      </w:pPr>
-    </w:p>
-    <w:p>
-      <w:pPr>
-        <w:jc w:val="both"/>
-      </w:pPr>
-    </w:p>
-    <w:p>
-      <w:pPr>
-        <w:jc w:val="both"/>
-      </w:pPr>
-    </w:p>
-    <w:p>
-      <w:pPr>
-        <w:jc w:val="both"/>
-      </w:pPr>
-    </w:p>
-    <w:p>
-      <w:pPr>
-        <w:spacing w:before="60" w:after="60"/>
-      </w:pPr>
-    </w:p>
-    <w:p>
-      <w:pPr>
-        <w:pStyle w:val="Heading3"/>
-      </w:pPr>
-      <w:r>
-        <w:lastRenderedPageBreak/>
-        <w:t xml:space="preserve">4.1 Categorical Feature </w:t>
-      </w:r>
-      <w:r>
-        <w:t xml:space="preserve">1: </w:t>
-      </w:r>
-      <w:r>
-        <w:t>Occupancy Status</w:t>
-      </w:r>
-    </w:p>
-    <w:p>
-      <w:pPr>
-        <w:spacing w:before="80" w:after="80"/>
-        <w:jc w:val="both"/>
-      </w:pPr>
-      <w:r>
-        <w:t xml:space="preserve">A bar chart was used to </w:t>
-      </w:r>
-      <w:r>
-        <w:t>visualize</w:t>
-      </w:r>
-      <w:r>
-        <w:t xml:space="preserve"> the distribution of occupancy categories, as bar charts are the standard method for comparing frequencies across distinct categorical groups.</w:t>
-      </w:r>
-    </w:p>
-    <w:p>
-      <w:pPr>
-        <w:spacing w:before="80" w:after="80"/>
-        <w:jc w:val="both"/>
-      </w:pPr>
-    </w:p>
-    <w:p>
-      <w:pPr>
-        <w:spacing w:before="80" w:after="40"/>
-        <w:jc w:val="center"/>
-      </w:pPr>
-    </w:p>
-    <w:p>
-      <w:pPr>
-        <w:spacing w:before="80" w:after="80"/>
-        <w:jc w:val="both"/>
-      </w:pPr>
-      <w:r>
-        <w:rPr>
-          <w:noProof/>
-        </w:rPr>
-        <w:drawing>
-          <wp:inline distT="0" distB="0" distL="0" distR="0" wp14:anchorId="5DEAA1BE" wp14:editId="20EC87FE">
-            <wp:extent cx="5731510" cy="2819400"/>
-            <wp:effectExtent l="0" t="0" r="2540" b="0"/>
-            <wp:docPr id="2119497733" name="Picture 1"/>
-            <wp:cNvGraphicFramePr>
-              <a:graphicFrameLocks xmlns:a="http://schemas.openxmlformats.org/drawingml/2006/main" noChangeAspect="1"/>
-            </wp:cNvGraphicFramePr>
-            <a:graphic xmlns:a="http://schemas.openxmlformats.org/drawingml/2006/main">
-              <a:graphicData uri="http://schemas.openxmlformats.org/drawingml/2006/picture">
-                <pic:pic xmlns:pic="http://schemas.openxmlformats.org/drawingml/2006/picture">
-                  <pic:nvPicPr>
-                    <pic:cNvPr id="2119497733" name=""/>
-                    <pic:cNvPicPr/>
-                  </pic:nvPicPr>
-                  <pic:blipFill>
-                    <a:blip r:embed="rId7"/>
-                    <a:stretch>
-                      <a:fillRect/>
-                    </a:stretch>
-                  </pic:blipFill>
-                  <pic:spPr>
-                    <a:xfrm>
-                      <a:off x="0" y="0"/>
-                      <a:ext cx="5731510" cy="2819400"/>
-                    </a:xfrm>
-                    <a:prstGeom prst="rect">
-                      <a:avLst/>
-                    </a:prstGeom>
-                  </pic:spPr>
-                </pic:pic>
-              </a:graphicData>
-            </a:graphic>
-          </wp:inline>
-        </w:drawing>
-      </w:r>
-    </w:p>
-    <w:p>
-      <w:pPr>
-        <w:spacing w:before="80" w:after="80"/>
-        <w:jc w:val="center"/>
-        <w:rPr>
-          <w:i/>
-          <w:iCs/>
-        </w:rPr>
-      </w:pPr>
-      <w:r>
-        <w:rPr>
-          <w:i/>
-          <w:iCs/>
-        </w:rPr>
-        <w:t>Figure 2: Occupancy Status bar plot against Count</w:t>
-      </w:r>
-    </w:p>
-    <w:p>
-      <w:pPr>
-        <w:spacing w:before="80" w:after="80"/>
-        <w:jc w:val="center"/>
-      </w:pPr>
-    </w:p>
-    <w:p>
-      <w:pPr>
-        <w:spacing w:before="80" w:after="80"/>
-        <w:jc w:val="center"/>
-      </w:pPr>
-    </w:p>
-    <w:p>
-      <w:pPr>
-        <w:spacing w:before="80" w:after="80"/>
-        <w:jc w:val="both"/>
-      </w:pPr>
-      <w:r>
-        <w:t>The chart reveals a heavily imbalanced distribution:</w:t>
-      </w:r>
-    </w:p>
-    <w:p>
-      <w:pPr>
-        <w:pStyle w:val="ListParagraph"/>
-        <w:numPr>
-          <w:ilvl w:val="0"/>
-          <w:numId w:val="2"/>
-        </w:numPr>
-        <w:spacing w:before="40" w:after="40"/>
-      </w:pPr>
-      <w:r>
-        <w:t>MANY_SEATS_AVAILABLE: ~47,500 services</w:t>
-      </w:r>
-      <w:r>
-        <w:t>, is</w:t>
-      </w:r>
-      <w:r>
-        <w:t xml:space="preserve"> the dominant category by a large margin</w:t>
-      </w:r>
-    </w:p>
-    <w:p>
-      <w:pPr>
-        <w:pStyle w:val="ListParagraph"/>
-        <w:numPr>
-          <w:ilvl w:val="0"/>
-          <w:numId w:val="2"/>
-        </w:numPr>
-        <w:spacing w:before="40" w:after="40"/>
-      </w:pPr>
-      <w:r>
-        <w:t>FEW_SEATS_AVAILABLE: ~1,581 services</w:t>
-      </w:r>
-      <w:r>
-        <w:t xml:space="preserve">, </w:t>
-      </w:r>
-      <w:r>
-        <w:t>significantly less common</w:t>
-      </w:r>
-    </w:p>
-    <w:p>
-      <w:pPr>
-        <w:pStyle w:val="ListParagraph"/>
-        <w:numPr>
-          <w:ilvl w:val="0"/>
-          <w:numId w:val="2"/>
-        </w:numPr>
-        <w:spacing w:before="40" w:after="40"/>
-      </w:pPr>
-      <w:r>
-        <w:t>STANDING_ROOM_ONLY: ~396 services</w:t>
-      </w:r>
-      <w:r>
-        <w:t xml:space="preserve">, </w:t>
-      </w:r>
-      <w:r>
-        <w:t>extremely rare</w:t>
-      </w:r>
-    </w:p>
-    <w:p>
-      <w:pPr>
-        <w:spacing w:before="60" w:after="60"/>
-      </w:pPr>
-    </w:p>
-    <w:p>
-      <w:pPr>
-        <w:spacing w:before="80" w:after="80"/>
-        <w:jc w:val="both"/>
-      </w:pPr>
-      <w:r>
-        <w:rPr>
-          <w:b/>
-          <w:bCs/>
-        </w:rPr>
-        <w:t>Insight:</w:t>
-      </w:r>
-      <w:r>
-        <w:t xml:space="preserve"> NSW trains are overwhelmingly uncrowded. The majority of services have many seats available, indicating that the network is not operating near capacity for most of the day. This class imbalance will be addressed</w:t>
-      </w:r>
-      <w:r>
-        <w:t xml:space="preserve"> during the</w:t>
-      </w:r>
-      <w:r>
-        <w:t xml:space="preserve"> Stage 2 modelling</w:t>
-      </w:r>
-      <w:r>
-        <w:t>.</w:t>
-      </w:r>
-    </w:p>
-    <w:p>
-      <w:pPr>
-        <w:spacing w:before="80" w:after="80"/>
-        <w:jc w:val="both"/>
-      </w:pPr>
-    </w:p>
-    <w:p>
-      <w:pPr>
-        <w:pStyle w:val="Heading3"/>
-      </w:pPr>
-      <w:r>
-        <w:t>4.2 Categorical Feature 2 — Segment Direction</w:t>
-      </w:r>
-    </w:p>
-    <w:p>
-      <w:pPr>
-        <w:spacing w:before="80" w:after="80"/>
-        <w:jc w:val="both"/>
-      </w:pPr>
-      <w:r>
-        <w:t>A bar chart was used to compare the number of services in each direction of travel</w:t>
-      </w:r>
-      <w:r>
-        <w:t xml:space="preserve"> since the values were discrete, bar charts make the most suitable option for visualization here</w:t>
-      </w:r>
-      <w:r>
-        <w:t>.</w:t>
-      </w:r>
-    </w:p>
-    <w:p>
-      <w:pPr>
-        <w:spacing w:before="80" w:after="80"/>
-        <w:jc w:val="both"/>
-      </w:pPr>
-    </w:p>
-    <w:p>
-      <w:pPr>
-        <w:spacing w:before="80" w:after="80"/>
-        <w:jc w:val="both"/>
-      </w:pPr>
-      <w:r>
-        <w:t>After removing trailing whitespace, exactly two categories were confirmed:</w:t>
-      </w:r>
-    </w:p>
-    <w:p>
-      <w:pPr>
-        <w:pStyle w:val="ListParagraph"/>
-        <w:numPr>
-          <w:ilvl w:val="0"/>
-          <w:numId w:val="2"/>
-        </w:numPr>
-        <w:spacing w:before="40" w:after="40"/>
-      </w:pPr>
-      <w:r>
-        <w:t>Up direction: ~24,939 services</w:t>
-      </w:r>
-    </w:p>
-    <w:p>
-      <w:pPr>
-        <w:pStyle w:val="ListParagraph"/>
-        <w:numPr>
-          <w:ilvl w:val="0"/>
-          <w:numId w:val="2"/>
-        </w:numPr>
-        <w:spacing w:before="40" w:after="40"/>
-      </w:pPr>
-      <w:r>
-        <w:t>Down direction: ~24,543 services</w:t>
-      </w:r>
-    </w:p>
-    <w:p>
-      <w:pPr>
-        <w:pStyle w:val="ListParagraph"/>
-        <w:spacing w:before="40" w:after="40"/>
-        <w:ind w:left="720"/>
-      </w:pPr>
-    </w:p>
-    <w:p>
-      <w:r>
-        <w:rPr>
-          <w:noProof/>
-        </w:rPr>
-        <w:lastRenderedPageBreak/>
-        <w:drawing>
-          <wp:inline distT="0" distB="0" distL="0" distR="0" wp14:anchorId="588CF3EC" wp14:editId="1E474AE9">
-            <wp:extent cx="5654040" cy="2971165"/>
-            <wp:effectExtent l="0" t="0" r="3810" b="635"/>
-            <wp:docPr id="1905537041" name="Picture 1"/>
-            <wp:cNvGraphicFramePr>
-              <a:graphicFrameLocks xmlns:a="http://schemas.openxmlformats.org/drawingml/2006/main" noChangeAspect="1"/>
-            </wp:cNvGraphicFramePr>
-            <a:graphic xmlns:a="http://schemas.openxmlformats.org/drawingml/2006/main">
-              <a:graphicData uri="http://schemas.openxmlformats.org/drawingml/2006/picture">
-                <pic:pic xmlns:pic="http://schemas.openxmlformats.org/drawingml/2006/picture">
-                  <pic:nvPicPr>
-                    <pic:cNvPr id="1905537041" name=""/>
-                    <pic:cNvPicPr/>
-                  </pic:nvPicPr>
-                  <pic:blipFill>
-                    <a:blip r:embed="rId8"/>
-                    <a:stretch>
-                      <a:fillRect/>
-                    </a:stretch>
-                  </pic:blipFill>
-                  <pic:spPr>
-                    <a:xfrm>
-                      <a:off x="0" y="0"/>
-                      <a:ext cx="5654040" cy="2971165"/>
-                    </a:xfrm>
-                    <a:prstGeom prst="rect">
-                      <a:avLst/>
-                    </a:prstGeom>
-                  </pic:spPr>
-                </pic:pic>
-              </a:graphicData>
-            </a:graphic>
-          </wp:inline>
-        </w:drawing>
-      </w:r>
-    </w:p>
-    <w:p>
-      <w:pPr>
-        <w:jc w:val="center"/>
-        <w:rPr>
-          <w:i/>
-          <w:iCs/>
-        </w:rPr>
-      </w:pPr>
-    </w:p>
-    <w:p>
-      <w:pPr>
-        <w:jc w:val="center"/>
-        <w:rPr>
-          <w:i/>
-          <w:iCs/>
-        </w:rPr>
-      </w:pPr>
-      <w:r>
-        <w:rPr>
-          <w:i/>
-          <w:iCs/>
-        </w:rPr>
-        <w:t>Figure 3: Segment Direction attribute bar graph plotted against Count</w:t>
-      </w:r>
-    </w:p>
-    <w:p>
-      <w:pPr>
-        <w:spacing w:before="60" w:after="60"/>
-      </w:pPr>
-    </w:p>
-    <w:p>
-      <w:pPr>
-        <w:spacing w:before="80" w:after="80"/>
-        <w:jc w:val="both"/>
-      </w:pPr>
-      <w:r>
-        <w:rPr>
-          <w:b/>
-          <w:bCs/>
-        </w:rPr>
-        <w:t>Insight:</w:t>
-      </w:r>
-      <w:r>
-        <w:t xml:space="preserve"> Train services are almost perfectly balanced between Up and Down directions. This is consistent with expectations for a </w:t>
-      </w:r>
-      <w:r>
-        <w:t>rail</w:t>
-      </w:r>
-      <w:r>
-        <w:t xml:space="preserve"> network</w:t>
-      </w:r>
-      <w:r>
-        <w:t xml:space="preserve">, that is: </w:t>
-      </w:r>
-      <w:r>
-        <w:t xml:space="preserve">for every service in one direction, there is a corresponding return service. This balance also indicates </w:t>
-      </w:r>
-      <w:r>
-        <w:t xml:space="preserve">that there are </w:t>
-      </w:r>
-      <w:r>
-        <w:t>no directional bias</w:t>
-      </w:r>
-      <w:r>
-        <w:t>es</w:t>
-      </w:r>
-      <w:r>
-        <w:t xml:space="preserve"> in the data.</w:t>
-      </w:r>
-    </w:p>
-    <w:p>
-      <w:pPr>
-        <w:spacing w:before="60" w:after="60"/>
-      </w:pPr>
-    </w:p>
-    <w:p>
-      <w:pPr>
-        <w:pStyle w:val="Heading3"/>
-      </w:pPr>
-      <w:r>
-        <w:t>4.3 Numerical Feature 1</w:t>
-      </w:r>
-      <w:r>
-        <w:t>:</w:t>
-      </w:r>
-      <w:r>
-        <w:t xml:space="preserve"> Node Sequence Order</w:t>
-      </w:r>
-    </w:p>
-    <w:p>
-      <w:pPr>
-        <w:spacing w:before="80" w:after="80"/>
-        <w:jc w:val="both"/>
-      </w:pPr>
-      <w:r>
-        <w:t xml:space="preserve">A histogram was used to </w:t>
-      </w:r>
-      <w:r>
-        <w:t>visualize</w:t>
-      </w:r>
-      <w:r>
-        <w:t xml:space="preserve"> the distribution of Node.Seq.Order, which represents the position of a station within a route (stop 1 being the first stop, stop 35 being the last on the longest routes).</w:t>
-      </w:r>
-    </w:p>
-    <w:p>
-      <w:pPr>
-        <w:spacing w:before="60" w:after="60"/>
-      </w:pPr>
-      <w:r>
-        <w:tab/>
-      </w:r>
-      <w:r>
-        <w:tab/>
-      </w:r>
-      <w:r>
-        <w:tab/>
-      </w:r>
-      <w:r>
-        <w:tab/>
-      </w:r>
-      <w:r>
-        <w:tab/>
-      </w:r>
-    </w:p>
-    <w:p>
-      <w:pPr>
-        <w:spacing w:before="60" w:after="60"/>
-      </w:pPr>
-      <w:r>
-        <w:rPr>
-          <w:noProof/>
-        </w:rPr>
-        <w:drawing>
-          <wp:inline distT="0" distB="0" distL="0" distR="0" wp14:anchorId="68B15911" wp14:editId="67891058">
-            <wp:extent cx="5731510" cy="2980055"/>
-            <wp:effectExtent l="0" t="0" r="2540" b="0"/>
-            <wp:docPr id="1883125575" name="Picture 1"/>
-            <wp:cNvGraphicFramePr>
-              <a:graphicFrameLocks xmlns:a="http://schemas.openxmlformats.org/drawingml/2006/main" noChangeAspect="1"/>
-            </wp:cNvGraphicFramePr>
-            <a:graphic xmlns:a="http://schemas.openxmlformats.org/drawingml/2006/main">
-              <a:graphicData uri="http://schemas.openxmlformats.org/drawingml/2006/picture">
-                <pic:pic xmlns:pic="http://schemas.openxmlformats.org/drawingml/2006/picture">
-                  <pic:nvPicPr>
-                    <pic:cNvPr id="1883125575" name=""/>
-                    <pic:cNvPicPr/>
-                  </pic:nvPicPr>
-                  <pic:blipFill>
-                    <a:blip r:embed="rId9"/>
-                    <a:stretch>
-                      <a:fillRect/>
-                    </a:stretch>
-                  </pic:blipFill>
-                  <pic:spPr>
-                    <a:xfrm>
-                      <a:off x="0" y="0"/>
-                      <a:ext cx="5731510" cy="2980055"/>
-                    </a:xfrm>
-                    <a:prstGeom prst="rect">
-                      <a:avLst/>
-                    </a:prstGeom>
-                  </pic:spPr>
-                </pic:pic>
-              </a:graphicData>
-            </a:graphic>
-          </wp:inline>
-        </w:drawing>
-      </w:r>
-    </w:p>
-    <w:p>
-      <w:pPr>
-        <w:spacing w:before="80" w:after="40"/>
-        <w:jc w:val="center"/>
-        <w:rPr>
-          <w:i/>
-          <w:iCs/>
-        </w:rPr>
-      </w:pPr>
-      <w:r>
-        <w:rPr>
-          <w:i/>
-          <w:iCs/>
-        </w:rPr>
-        <w:t xml:space="preserve">Figure </w:t>
-      </w:r>
-      <w:r>
-        <w:rPr>
-          <w:i/>
-          <w:iCs/>
-        </w:rPr>
-        <w:t>4:</w:t>
-      </w:r>
-      <w:r>
-        <w:rPr>
-          <w:i/>
-          <w:iCs/>
-        </w:rPr>
-        <w:t xml:space="preserve"> Distribution of Node Sequence Order — frequency of observations per stop position</w:t>
-      </w:r>
-    </w:p>
-    <w:p>
-      <w:pPr>
-        <w:pStyle w:val="ListParagraph"/>
-        <w:numPr>
-          <w:ilvl w:val="0"/>
-          <w:numId w:val="2"/>
-        </w:numPr>
-        <w:spacing w:before="40" w:after="40"/>
-      </w:pPr>
-      <w:r>
-        <w:lastRenderedPageBreak/>
-        <w:t>Stop 1 has the highest frequency</w:t>
-      </w:r>
-      <w:r>
-        <w:t xml:space="preserve">, </w:t>
-      </w:r>
-      <w:r>
-        <w:t>every route starts here, so all services contribute a record at stop 1</w:t>
-      </w:r>
-      <w:r>
-        <w:t>.</w:t>
-      </w:r>
-    </w:p>
-    <w:p>
-      <w:pPr>
-        <w:pStyle w:val="ListParagraph"/>
-        <w:numPr>
-          <w:ilvl w:val="0"/>
-          <w:numId w:val="2"/>
-        </w:numPr>
-        <w:spacing w:before="40" w:after="40"/>
-      </w:pPr>
-      <w:r>
-        <w:t>Frequency decreases as stop number increases</w:t>
-      </w:r>
-      <w:r>
-        <w:t xml:space="preserve">, </w:t>
-      </w:r>
-      <w:r>
-        <w:t>only longer routes reach higher stop numbers</w:t>
-      </w:r>
-      <w:r>
-        <w:t>.</w:t>
-      </w:r>
-    </w:p>
-    <w:p>
-      <w:pPr>
-        <w:pStyle w:val="ListParagraph"/>
-        <w:numPr>
-          <w:ilvl w:val="0"/>
-          <w:numId w:val="2"/>
-        </w:numPr>
-        <w:spacing w:before="40" w:after="40"/>
-      </w:pPr>
-      <w:r>
-        <w:t>Very few observations exist beyond stop 15, indicating that most NSW train routes have fewer than 15 stops</w:t>
-      </w:r>
-      <w:r>
-        <w:t>.</w:t>
-      </w:r>
-    </w:p>
-    <w:p>
-      <w:pPr>
-        <w:spacing w:before="60" w:after="60"/>
-      </w:pPr>
-    </w:p>
-    <w:p>
-      <w:pPr>
-        <w:spacing w:before="80" w:after="80"/>
-        <w:jc w:val="both"/>
-      </w:pPr>
-      <w:r>
-        <w:rPr>
-          <w:b/>
-          <w:bCs/>
-        </w:rPr>
-        <w:t>Insight:</w:t>
-      </w:r>
-      <w:r>
-        <w:t xml:space="preserve"> Most train services in NSW have fewer than 15 stops, with stop position frequency decreasing as sequence order increases, </w:t>
-      </w:r>
-      <w:r>
-        <w:t>suggesting</w:t>
-      </w:r>
-      <w:r>
-        <w:t xml:space="preserve"> that longer routes are less common in the</w:t>
-      </w:r>
-      <w:r>
-        <w:t xml:space="preserve"> train</w:t>
-      </w:r>
-      <w:r>
-        <w:t xml:space="preserve"> network. </w:t>
-      </w:r>
-      <w:r>
-        <w:rPr>
-          <w:b/>
-          <w:bCs/>
-        </w:rPr>
-        <w:t>This feature is relevant to the research question as occupancy may increase along a route as passengers board.</w:t>
-      </w:r>
-    </w:p>
-    <w:p>
-      <w:pPr>
-        <w:spacing w:before="80" w:after="80"/>
-        <w:jc w:val="both"/>
-      </w:pPr>
-    </w:p>
-    <w:p>
-      <w:pPr>
-        <w:pStyle w:val="Heading3"/>
-      </w:pPr>
-      <w:r>
-        <w:t>4.4 Numerical Feature 2</w:t>
-      </w:r>
-      <w:r>
-        <w:t xml:space="preserve">: </w:t>
-      </w:r>
-      <w:r>
-        <w:t xml:space="preserve"> Day</w:t>
-      </w:r>
-    </w:p>
-    <w:p>
-      <w:pPr>
-        <w:pStyle w:val="Heading3"/>
-      </w:pPr>
-    </w:p>
-    <w:p>
-      <w:pPr>
-        <w:spacing w:before="80" w:after="80"/>
-        <w:jc w:val="both"/>
-      </w:pPr>
-      <w:r>
-        <w:rPr>
-          <w:b/>
-          <w:bCs/>
-        </w:rPr>
-        <w:t>Carried out process:</w:t>
-      </w:r>
-      <w:r>
-        <w:t xml:space="preserve"> Initially a histogram was used to visualize the train services assuming that the day attribute in the dataset represented days of the week instead of calendar dates over the span of 8 days from day 9 to day 16.</w:t>
-      </w:r>
-    </w:p>
-    <w:p>
-      <w:pPr>
-        <w:spacing w:before="80" w:after="80"/>
-        <w:jc w:val="both"/>
-      </w:pPr>
-    </w:p>
-    <w:p>
-      <w:pPr>
-        <w:spacing w:before="80" w:after="80"/>
-        <w:jc w:val="both"/>
-      </w:pPr>
-      <w:r>
-        <w:t xml:space="preserve">Hence, a bar chart was used to </w:t>
-      </w:r>
-      <w:r>
-        <w:t>visualize</w:t>
-      </w:r>
-      <w:r>
-        <w:t xml:space="preserve"> the number of train services recorded per calendar day, providing a clearer view than a histogram given the discrete nature of the day values.</w:t>
-      </w:r>
-    </w:p>
-    <w:p>
-      <w:pPr>
-        <w:spacing w:before="80" w:after="80"/>
-        <w:jc w:val="both"/>
-      </w:pPr>
-    </w:p>
-    <w:p>
-      <w:pPr>
-        <w:spacing w:before="60" w:after="60"/>
-      </w:pPr>
-      <w:r>
-        <w:rPr>
-          <w:noProof/>
-        </w:rPr>
-        <w:drawing>
-          <wp:inline distT="0" distB="0" distL="0" distR="0" wp14:anchorId="71E9F034" wp14:editId="6C4CA747">
-            <wp:extent cx="5731510" cy="3084195"/>
-            <wp:effectExtent l="0" t="0" r="2540" b="1905"/>
-            <wp:docPr id="1215034827" name="Picture 1"/>
-            <wp:cNvGraphicFramePr>
-              <a:graphicFrameLocks xmlns:a="http://schemas.openxmlformats.org/drawingml/2006/main" noChangeAspect="1"/>
-            </wp:cNvGraphicFramePr>
-            <a:graphic xmlns:a="http://schemas.openxmlformats.org/drawingml/2006/main">
-              <a:graphicData uri="http://schemas.openxmlformats.org/drawingml/2006/picture">
-                <pic:pic xmlns:pic="http://schemas.openxmlformats.org/drawingml/2006/picture">
-                  <pic:nvPicPr>
-                    <pic:cNvPr id="1215034827" name=""/>
-                    <pic:cNvPicPr/>
-                  </pic:nvPicPr>
-                  <pic:blipFill>
-                    <a:blip r:embed="rId10"/>
-                    <a:stretch>
-                      <a:fillRect/>
-                    </a:stretch>
-                  </pic:blipFill>
-                  <pic:spPr>
-                    <a:xfrm>
-                      <a:off x="0" y="0"/>
-                      <a:ext cx="5731510" cy="3084195"/>
-                    </a:xfrm>
-                    <a:prstGeom prst="rect">
-                      <a:avLst/>
-                    </a:prstGeom>
-                  </pic:spPr>
-                </pic:pic>
-              </a:graphicData>
-            </a:graphic>
-          </wp:inline>
-        </w:drawing>
-      </w:r>
-    </w:p>
-    <w:p>
-      <w:pPr>
-        <w:spacing w:before="40" w:after="120"/>
-        <w:jc w:val="center"/>
-        <w:rPr>
-          <w:i/>
-          <w:iCs/>
-        </w:rPr>
-      </w:pPr>
-      <w:r>
-        <w:rPr>
-          <w:i/>
-          <w:iCs/>
-        </w:rPr>
-        <w:t>Figure 5: Number of train services recorded per calendar day (days 9–16)</w:t>
-      </w:r>
-    </w:p>
-    <w:p>
-      <w:pPr>
-        <w:spacing w:before="40" w:after="120"/>
-        <w:jc w:val="center"/>
-        <w:rPr>
-          <w:i/>
-          <w:iCs/>
-        </w:rPr>
-      </w:pPr>
-    </w:p>
-    <w:p>
-      <w:pPr>
-        <w:pStyle w:val="ListParagraph"/>
-        <w:numPr>
-          <w:ilvl w:val="0"/>
-          <w:numId w:val="2"/>
-        </w:numPr>
-        <w:spacing w:before="40" w:after="40"/>
-      </w:pPr>
-      <w:r>
-        <w:t>Day 9: Very few services</w:t>
-      </w:r>
-      <w:r>
-        <w:t xml:space="preserve"> were recorded assuming the data collection had just started.</w:t>
-      </w:r>
-      <w:r>
-        <w:t xml:space="preserve"> </w:t>
-      </w:r>
-    </w:p>
-    <w:p>
-      <w:pPr>
-        <w:pStyle w:val="ListParagraph"/>
-        <w:numPr>
-          <w:ilvl w:val="0"/>
-          <w:numId w:val="2"/>
-        </w:numPr>
-        <w:spacing w:before="40" w:after="40"/>
-      </w:pPr>
-      <w:r>
-        <w:t>Days 10–13: Consistently ~8,000 services each weekday operations</w:t>
-      </w:r>
-      <w:r>
-        <w:t xml:space="preserve"> were observed.</w:t>
-      </w:r>
-    </w:p>
-    <w:p>
-      <w:pPr>
-        <w:pStyle w:val="ListParagraph"/>
-        <w:numPr>
-          <w:ilvl w:val="0"/>
-          <w:numId w:val="2"/>
-        </w:numPr>
-        <w:spacing w:before="40" w:after="40"/>
-      </w:pPr>
-      <w:r>
-        <w:t>Day 14: ~5,000 services</w:t>
-      </w:r>
-      <w:r>
-        <w:t>,</w:t>
-      </w:r>
-      <w:r>
-        <w:t xml:space="preserve"> consistent with a Saturday (fewer commuter services)</w:t>
-      </w:r>
-      <w:r>
-        <w:t>.</w:t>
-      </w:r>
-    </w:p>
-    <w:p>
-      <w:pPr>
-        <w:pStyle w:val="ListParagraph"/>
-        <w:numPr>
-          <w:ilvl w:val="0"/>
-          <w:numId w:val="2"/>
-        </w:numPr>
-        <w:spacing w:before="40" w:after="40"/>
-      </w:pPr>
-      <w:r>
-        <w:t>Days 15–16: Combined ~12,500 services</w:t>
-      </w:r>
-      <w:r>
-        <w:t xml:space="preserve"> </w:t>
-      </w:r>
-      <w:r>
-        <w:t>covering Sunday and the return to Monday</w:t>
-      </w:r>
-      <w:r>
-        <w:t>.</w:t>
-      </w:r>
-    </w:p>
-    <w:p>
-      <w:pPr>
-        <w:spacing w:before="60" w:after="60"/>
-      </w:pPr>
-    </w:p>
-    <w:p>
-      <w:pPr>
-        <w:spacing w:before="80" w:after="80"/>
-        <w:jc w:val="both"/>
-      </w:pPr>
-      <w:r>
-        <w:rPr>
-          <w:b/>
-          <w:bCs/>
-        </w:rPr>
-        <w:t>Insight:</w:t>
-      </w:r>
-      <w:r>
-        <w:t xml:space="preserve"> The day column represents calendar dates rather than day-of-week numbers. The dataset spans 8 days of train service records. Weekday services (days 10</w:t>
-      </w:r>
-      <w:r>
-        <w:t xml:space="preserve"> to </w:t>
-      </w:r>
-      <w:r>
-        <w:t>13, 16) averaged approximately 7,900 train services per day, while weekend services (days 14</w:t>
-      </w:r>
-      <w:r>
-        <w:t xml:space="preserve"> to </w:t>
-      </w:r>
-      <w:r>
-        <w:t>15) averaged only 5,100</w:t>
-      </w:r>
-      <w:r>
-        <w:t xml:space="preserve">, </w:t>
-      </w:r>
-      <w:r>
-        <w:t>implying ab</w:t>
-      </w:r>
-      <w:r>
-        <w:t>out 35% fewer services on weekends, reflecting lower commuter demand.</w:t>
-      </w:r>
-    </w:p>
-    <w:p>
-      <w:pPr>
-        <w:spacing w:before="60" w:after="60"/>
-      </w:pPr>
-    </w:p>
-    <w:p>
-      <w:pPr>
-        <w:pStyle w:val="Heading3"/>
-      </w:pPr>
-      <w:r>
-        <w:t>4.5 Correlation Between Numerical Features</w:t>
-      </w:r>
-    </w:p>
-    <w:p>
-      <w:pPr>
-        <w:spacing w:before="80" w:after="80"/>
-        <w:jc w:val="both"/>
-      </w:pPr>
-      <w:r>
-        <w:t>A correlation matrix was computed between the two numerical features</w:t>
-      </w:r>
-      <w:r>
-        <w:t xml:space="preserve">: </w:t>
-      </w:r>
-      <w:r>
-        <w:t>day and Node.Seq.Order</w:t>
-      </w:r>
-      <w:r>
-        <w:t xml:space="preserve">, </w:t>
-      </w:r>
-      <w:r>
-        <w:t>to assess any linear relationship between them.</w:t>
-      </w:r>
-    </w:p>
-    <w:p>
-      <w:pPr>
-        <w:spacing w:before="60" w:after="60"/>
-      </w:pPr>
-    </w:p>
-    <w:p>
-      <w:pPr>
-        <w:spacing w:before="80" w:after="40"/>
-        <w:jc w:val="center"/>
-      </w:pPr>
-    </w:p>
-    <w:p>
-      <w:pPr>
-        <w:spacing w:before="40" w:after="120"/>
-        <w:jc w:val="center"/>
-      </w:pPr>
-      <w:r>
-        <w:rPr>
-          <w:noProof/>
-        </w:rPr>
-        <w:drawing>
-          <wp:inline distT="0" distB="0" distL="0" distR="0" wp14:anchorId="6A7C4F0D" wp14:editId="5E48B4B2">
-            <wp:extent cx="5731510" cy="2185670"/>
-            <wp:effectExtent l="0" t="0" r="2540" b="5080"/>
-            <wp:docPr id="1649717243" name="Picture 1"/>
-            <wp:cNvGraphicFramePr>
-              <a:graphicFrameLocks xmlns:a="http://schemas.openxmlformats.org/drawingml/2006/main" noChangeAspect="1"/>
-            </wp:cNvGraphicFramePr>
-            <a:graphic xmlns:a="http://schemas.openxmlformats.org/drawingml/2006/main">
-              <a:graphicData uri="http://schemas.openxmlformats.org/drawingml/2006/picture">
-                <pic:pic xmlns:pic="http://schemas.openxmlformats.org/drawingml/2006/picture">
-                  <pic:nvPicPr>
-                    <pic:cNvPr id="1649717243" name="Picture 1649717243"/>
-                    <pic:cNvPicPr/>
-                  </pic:nvPicPr>
-                  <pic:blipFill>
-                    <a:blip r:embed="rId11">
+                    <a:blip r:embed="rId6">
                       <a:extLst>
                         <a:ext uri="{28A0092B-C50C-407E-A947-70E740481C1C}">
                           <a14:useLocalDpi xmlns:a14="http://schemas.microsoft.com/office/drawing/2010/main" val="0"/>
@@ -5023,7 +4306,7 @@
                   <pic:spPr>
                     <a:xfrm>
                       <a:off x="0" y="0"/>
-                      <a:ext cx="5731510" cy="2185670"/>
+                      <a:ext cx="5731510" cy="2832735"/>
                     </a:xfrm>
                     <a:prstGeom prst="rect">
                       <a:avLst/>
@@ -5038,6 +4321,728 @@
     </w:p>
     <w:p>
       <w:pPr>
+        <w:spacing w:before="80" w:after="80"/>
+        <w:jc w:val="center"/>
+        <w:rPr>
+          <w:i/>
+          <w:iCs/>
+        </w:rPr>
+      </w:pPr>
+      <w:r>
+        <w:rPr>
+          <w:i/>
+          <w:iCs/>
+        </w:rPr>
+        <w:t xml:space="preserve">Figure </w:t>
+      </w:r>
+      <w:r>
+        <w:rPr>
+          <w:i/>
+          <w:iCs/>
+        </w:rPr>
+        <w:t>1</w:t>
+      </w:r>
+      <w:r>
+        <w:rPr>
+          <w:i/>
+          <w:iCs/>
+        </w:rPr>
+        <w:t>: Occupancy Status bar plot against Count</w:t>
+      </w:r>
+    </w:p>
+    <w:p>
+      <w:pPr>
+        <w:spacing w:before="80" w:after="80"/>
+        <w:jc w:val="center"/>
+      </w:pPr>
+    </w:p>
+    <w:p>
+      <w:pPr>
+        <w:spacing w:before="80" w:after="80"/>
+        <w:jc w:val="center"/>
+      </w:pPr>
+    </w:p>
+    <w:p>
+      <w:pPr>
+        <w:spacing w:before="80" w:after="80"/>
+        <w:jc w:val="both"/>
+      </w:pPr>
+      <w:r>
+        <w:t>The chart reveals a heavily imbalanced distribution:</w:t>
+      </w:r>
+    </w:p>
+    <w:p>
+      <w:pPr>
+        <w:pStyle w:val="ListParagraph"/>
+        <w:numPr>
+          <w:ilvl w:val="0"/>
+          <w:numId w:val="2"/>
+        </w:numPr>
+        <w:spacing w:before="40" w:after="40"/>
+      </w:pPr>
+      <w:r>
+        <w:t>MANY_SEATS_AVAILABLE: ~47,500 services</w:t>
+      </w:r>
+      <w:r>
+        <w:t>, is</w:t>
+      </w:r>
+      <w:r>
+        <w:t xml:space="preserve"> the dominant category by a large margin</w:t>
+      </w:r>
+    </w:p>
+    <w:p>
+      <w:pPr>
+        <w:pStyle w:val="ListParagraph"/>
+        <w:numPr>
+          <w:ilvl w:val="0"/>
+          <w:numId w:val="2"/>
+        </w:numPr>
+        <w:spacing w:before="40" w:after="40"/>
+      </w:pPr>
+      <w:r>
+        <w:t>FEW_SEATS_AVAILABLE: ~1,581 services</w:t>
+      </w:r>
+      <w:r>
+        <w:t xml:space="preserve">, </w:t>
+      </w:r>
+      <w:r>
+        <w:t>significantly less common</w:t>
+      </w:r>
+    </w:p>
+    <w:p>
+      <w:pPr>
+        <w:pStyle w:val="ListParagraph"/>
+        <w:numPr>
+          <w:ilvl w:val="0"/>
+          <w:numId w:val="2"/>
+        </w:numPr>
+        <w:spacing w:before="40" w:after="40"/>
+      </w:pPr>
+      <w:r>
+        <w:t>STANDING_ROOM_ONLY: ~396 services</w:t>
+      </w:r>
+      <w:r>
+        <w:t xml:space="preserve">, </w:t>
+      </w:r>
+      <w:r>
+        <w:t>extremely rare</w:t>
+      </w:r>
+    </w:p>
+    <w:p>
+      <w:pPr>
+        <w:spacing w:before="60" w:after="60"/>
+      </w:pPr>
+    </w:p>
+    <w:p>
+      <w:pPr>
+        <w:spacing w:before="80" w:after="80"/>
+        <w:jc w:val="both"/>
+      </w:pPr>
+      <w:r>
+        <w:rPr>
+          <w:b/>
+          <w:bCs/>
+        </w:rPr>
+        <w:t>Insight:</w:t>
+      </w:r>
+      <w:r>
+        <w:t xml:space="preserve"> NSW trains are overwhelmingly uncrowded. The majority of services have many seats available, indicating that the network is not operating near capacity for most of the day. This class imbalance will be addressed</w:t>
+      </w:r>
+      <w:r>
+        <w:t xml:space="preserve"> during the</w:t>
+      </w:r>
+      <w:r>
+        <w:t xml:space="preserve"> Stage 2 modelling</w:t>
+      </w:r>
+      <w:r>
+        <w:t>.</w:t>
+      </w:r>
+    </w:p>
+    <w:p>
+      <w:pPr>
+        <w:spacing w:before="80" w:after="80"/>
+        <w:jc w:val="both"/>
+      </w:pPr>
+    </w:p>
+    <w:p>
+      <w:pPr>
+        <w:pStyle w:val="Heading3"/>
+      </w:pPr>
+      <w:r>
+        <w:t>4.2 Categorical Feature 2 — Segment Direction</w:t>
+      </w:r>
+    </w:p>
+    <w:p>
+      <w:pPr>
+        <w:spacing w:before="80" w:after="80"/>
+        <w:jc w:val="both"/>
+      </w:pPr>
+      <w:r>
+        <w:t>A bar chart was used to compare the number of services in each direction of travel</w:t>
+      </w:r>
+      <w:r>
+        <w:t xml:space="preserve"> since the values were discrete, bar charts make the most suitable option for visualization here</w:t>
+      </w:r>
+      <w:r>
+        <w:t>.</w:t>
+      </w:r>
+    </w:p>
+    <w:p>
+      <w:pPr>
+        <w:spacing w:before="80" w:after="80"/>
+        <w:jc w:val="both"/>
+      </w:pPr>
+    </w:p>
+    <w:p>
+      <w:pPr>
+        <w:spacing w:before="80" w:after="80"/>
+        <w:jc w:val="both"/>
+      </w:pPr>
+      <w:r>
+        <w:t>After removing trailing whitespace, exactly two categories were confirmed:</w:t>
+      </w:r>
+    </w:p>
+    <w:p>
+      <w:pPr>
+        <w:pStyle w:val="ListParagraph"/>
+        <w:numPr>
+          <w:ilvl w:val="0"/>
+          <w:numId w:val="2"/>
+        </w:numPr>
+        <w:spacing w:before="40" w:after="40"/>
+      </w:pPr>
+      <w:r>
+        <w:t>Up direction: ~24,939 services</w:t>
+      </w:r>
+    </w:p>
+    <w:p>
+      <w:pPr>
+        <w:pStyle w:val="ListParagraph"/>
+        <w:numPr>
+          <w:ilvl w:val="0"/>
+          <w:numId w:val="2"/>
+        </w:numPr>
+        <w:spacing w:before="40" w:after="40"/>
+      </w:pPr>
+      <w:r>
+        <w:t>Down direction: ~24,543 services</w:t>
+      </w:r>
+    </w:p>
+    <w:p>
+      <w:pPr>
+        <w:pStyle w:val="ListParagraph"/>
+        <w:spacing w:before="40" w:after="40"/>
+        <w:ind w:left="720"/>
+      </w:pPr>
+    </w:p>
+    <w:p>
+      <w:r>
+        <w:rPr>
+          <w:noProof/>
+        </w:rPr>
+        <w:drawing>
+          <wp:inline distT="0" distB="0" distL="0" distR="0" wp14:anchorId="6D235722" wp14:editId="19DE7BBD">
+            <wp:extent cx="5731510" cy="3354070"/>
+            <wp:effectExtent l="0" t="0" r="2540" b="0"/>
+            <wp:docPr id="2096181085" name="Picture 2"/>
+            <wp:cNvGraphicFramePr>
+              <a:graphicFrameLocks xmlns:a="http://schemas.openxmlformats.org/drawingml/2006/main" noChangeAspect="1"/>
+            </wp:cNvGraphicFramePr>
+            <a:graphic xmlns:a="http://schemas.openxmlformats.org/drawingml/2006/main">
+              <a:graphicData uri="http://schemas.openxmlformats.org/drawingml/2006/picture">
+                <pic:pic xmlns:pic="http://schemas.openxmlformats.org/drawingml/2006/picture">
+                  <pic:nvPicPr>
+                    <pic:cNvPr id="2096181085" name="Picture 2096181085"/>
+                    <pic:cNvPicPr/>
+                  </pic:nvPicPr>
+                  <pic:blipFill>
+                    <a:blip r:embed="rId7">
+                      <a:extLst>
+                        <a:ext uri="{28A0092B-C50C-407E-A947-70E740481C1C}">
+                          <a14:useLocalDpi xmlns:a14="http://schemas.microsoft.com/office/drawing/2010/main" val="0"/>
+                        </a:ext>
+                      </a:extLst>
+                    </a:blip>
+                    <a:stretch>
+                      <a:fillRect/>
+                    </a:stretch>
+                  </pic:blipFill>
+                  <pic:spPr>
+                    <a:xfrm>
+                      <a:off x="0" y="0"/>
+                      <a:ext cx="5731510" cy="3354070"/>
+                    </a:xfrm>
+                    <a:prstGeom prst="rect">
+                      <a:avLst/>
+                    </a:prstGeom>
+                  </pic:spPr>
+                </pic:pic>
+              </a:graphicData>
+            </a:graphic>
+          </wp:inline>
+        </w:drawing>
+      </w:r>
+    </w:p>
+    <w:p>
+      <w:pPr>
+        <w:jc w:val="center"/>
+        <w:rPr>
+          <w:i/>
+          <w:iCs/>
+        </w:rPr>
+      </w:pPr>
+    </w:p>
+    <w:p>
+      <w:pPr>
+        <w:jc w:val="center"/>
+        <w:rPr>
+          <w:i/>
+          <w:iCs/>
+        </w:rPr>
+      </w:pPr>
+      <w:r>
+        <w:rPr>
+          <w:i/>
+          <w:iCs/>
+        </w:rPr>
+        <w:t xml:space="preserve">Figure </w:t>
+      </w:r>
+      <w:r>
+        <w:rPr>
+          <w:i/>
+          <w:iCs/>
+        </w:rPr>
+        <w:t>2</w:t>
+      </w:r>
+      <w:r>
+        <w:rPr>
+          <w:i/>
+          <w:iCs/>
+        </w:rPr>
+        <w:t>: Segment Direction attribute bar graph plotted against Count</w:t>
+      </w:r>
+    </w:p>
+    <w:p>
+      <w:pPr>
+        <w:spacing w:before="60" w:after="60"/>
+      </w:pPr>
+    </w:p>
+    <w:p>
+      <w:pPr>
+        <w:spacing w:before="80" w:after="80"/>
+        <w:jc w:val="both"/>
+      </w:pPr>
+      <w:r>
+        <w:rPr>
+          <w:b/>
+          <w:bCs/>
+        </w:rPr>
+        <w:t>Insight:</w:t>
+      </w:r>
+      <w:r>
+        <w:t xml:space="preserve"> Train services are almost perfectly balanced between Up and Down directions. This is consistent with expectations for a </w:t>
+      </w:r>
+      <w:r>
+        <w:t>rail</w:t>
+      </w:r>
+      <w:r>
+        <w:t xml:space="preserve"> network</w:t>
+      </w:r>
+      <w:r>
+        <w:t xml:space="preserve">, that is: </w:t>
+      </w:r>
+      <w:r>
+        <w:t xml:space="preserve">for every service in one direction, there is a corresponding return service. This balance also indicates </w:t>
+      </w:r>
+      <w:r>
+        <w:t xml:space="preserve">that there are </w:t>
+      </w:r>
+      <w:r>
+        <w:t>no directional bias</w:t>
+      </w:r>
+      <w:r>
+        <w:t>es</w:t>
+      </w:r>
+      <w:r>
+        <w:t xml:space="preserve"> in the data.</w:t>
+      </w:r>
+    </w:p>
+    <w:p>
+      <w:pPr>
+        <w:spacing w:before="60" w:after="60"/>
+      </w:pPr>
+    </w:p>
+    <w:p>
+      <w:pPr>
+        <w:pStyle w:val="Heading3"/>
+      </w:pPr>
+      <w:r>
+        <w:lastRenderedPageBreak/>
+        <w:t>4.3 Numerical Feature 1</w:t>
+      </w:r>
+      <w:r>
+        <w:t>:</w:t>
+      </w:r>
+      <w:r>
+        <w:t xml:space="preserve"> Node Sequence Order</w:t>
+      </w:r>
+    </w:p>
+    <w:p>
+      <w:pPr>
+        <w:spacing w:before="80" w:after="80"/>
+        <w:jc w:val="both"/>
+      </w:pPr>
+      <w:r>
+        <w:t xml:space="preserve">A histogram was used to </w:t>
+      </w:r>
+      <w:r>
+        <w:t>visualize</w:t>
+      </w:r>
+      <w:r>
+        <w:t xml:space="preserve"> the distribution of </w:t>
+      </w:r>
+      <w:proofErr w:type="spellStart"/>
+      <w:proofErr w:type="gramStart"/>
+      <w:r>
+        <w:t>Node.Seq.Order</w:t>
+      </w:r>
+      <w:proofErr w:type="spellEnd"/>
+      <w:proofErr w:type="gramEnd"/>
+      <w:r>
+        <w:t>, which represents the position of a station within a route (stop 1 being the first stop, stop 35 being the last on the longest routes).</w:t>
+      </w:r>
+    </w:p>
+    <w:p>
+      <w:pPr>
+        <w:spacing w:before="60" w:after="60"/>
+      </w:pPr>
+      <w:r>
+        <w:tab/>
+      </w:r>
+      <w:r>
+        <w:tab/>
+      </w:r>
+      <w:r>
+        <w:tab/>
+      </w:r>
+      <w:r>
+        <w:tab/>
+      </w:r>
+      <w:r>
+        <w:tab/>
+      </w:r>
+    </w:p>
+    <w:p>
+      <w:pPr>
+        <w:spacing w:before="60" w:after="60"/>
+      </w:pPr>
+      <w:r>
+        <w:rPr>
+          <w:noProof/>
+        </w:rPr>
+        <w:drawing>
+          <wp:inline distT="0" distB="0" distL="0" distR="0" wp14:anchorId="78D8EB9C" wp14:editId="61890D58">
+            <wp:extent cx="5731510" cy="2896870"/>
+            <wp:effectExtent l="0" t="0" r="2540" b="0"/>
+            <wp:docPr id="591412649" name="Picture 3"/>
+            <wp:cNvGraphicFramePr>
+              <a:graphicFrameLocks xmlns:a="http://schemas.openxmlformats.org/drawingml/2006/main" noChangeAspect="1"/>
+            </wp:cNvGraphicFramePr>
+            <a:graphic xmlns:a="http://schemas.openxmlformats.org/drawingml/2006/main">
+              <a:graphicData uri="http://schemas.openxmlformats.org/drawingml/2006/picture">
+                <pic:pic xmlns:pic="http://schemas.openxmlformats.org/drawingml/2006/picture">
+                  <pic:nvPicPr>
+                    <pic:cNvPr id="591412649" name="Picture 591412649"/>
+                    <pic:cNvPicPr/>
+                  </pic:nvPicPr>
+                  <pic:blipFill>
+                    <a:blip r:embed="rId8">
+                      <a:extLst>
+                        <a:ext uri="{28A0092B-C50C-407E-A947-70E740481C1C}">
+                          <a14:useLocalDpi xmlns:a14="http://schemas.microsoft.com/office/drawing/2010/main" val="0"/>
+                        </a:ext>
+                      </a:extLst>
+                    </a:blip>
+                    <a:stretch>
+                      <a:fillRect/>
+                    </a:stretch>
+                  </pic:blipFill>
+                  <pic:spPr>
+                    <a:xfrm>
+                      <a:off x="0" y="0"/>
+                      <a:ext cx="5731510" cy="2896870"/>
+                    </a:xfrm>
+                    <a:prstGeom prst="rect">
+                      <a:avLst/>
+                    </a:prstGeom>
+                  </pic:spPr>
+                </pic:pic>
+              </a:graphicData>
+            </a:graphic>
+          </wp:inline>
+        </w:drawing>
+      </w:r>
+    </w:p>
+    <w:p>
+      <w:pPr>
+        <w:spacing w:before="80" w:after="40"/>
+        <w:jc w:val="center"/>
+        <w:rPr>
+          <w:i/>
+          <w:iCs/>
+        </w:rPr>
+      </w:pPr>
+      <w:r>
+        <w:rPr>
+          <w:i/>
+          <w:iCs/>
+        </w:rPr>
+        <w:t xml:space="preserve">Figure </w:t>
+      </w:r>
+      <w:r>
+        <w:rPr>
+          <w:i/>
+          <w:iCs/>
+        </w:rPr>
+        <w:t>3</w:t>
+      </w:r>
+      <w:r>
+        <w:rPr>
+          <w:i/>
+          <w:iCs/>
+        </w:rPr>
+        <w:t>:</w:t>
+      </w:r>
+      <w:r>
+        <w:rPr>
+          <w:i/>
+          <w:iCs/>
+        </w:rPr>
+        <w:t xml:space="preserve"> Distribution of Node Sequence Order — frequency of observations per stop position</w:t>
+      </w:r>
+    </w:p>
+    <w:p>
+      <w:pPr>
+        <w:pStyle w:val="ListParagraph"/>
+        <w:numPr>
+          <w:ilvl w:val="0"/>
+          <w:numId w:val="2"/>
+        </w:numPr>
+        <w:spacing w:before="40" w:after="40"/>
+      </w:pPr>
+      <w:r>
+        <w:t>Stop 1 has the highest frequency</w:t>
+      </w:r>
+      <w:r>
+        <w:t xml:space="preserve">, </w:t>
+      </w:r>
+      <w:r>
+        <w:t>every route starts here, so all services contribute a record at stop 1</w:t>
+      </w:r>
+      <w:r>
+        <w:t>.</w:t>
+      </w:r>
+    </w:p>
+    <w:p>
+      <w:pPr>
+        <w:pStyle w:val="ListParagraph"/>
+        <w:numPr>
+          <w:ilvl w:val="0"/>
+          <w:numId w:val="2"/>
+        </w:numPr>
+        <w:spacing w:before="40" w:after="40"/>
+      </w:pPr>
+      <w:r>
+        <w:t>Frequency decreases as stop number increases</w:t>
+      </w:r>
+      <w:r>
+        <w:t xml:space="preserve">, </w:t>
+      </w:r>
+      <w:r>
+        <w:t>only longer routes reach higher stop numbers</w:t>
+      </w:r>
+      <w:r>
+        <w:t>.</w:t>
+      </w:r>
+    </w:p>
+    <w:p>
+      <w:pPr>
+        <w:pStyle w:val="ListParagraph"/>
+        <w:numPr>
+          <w:ilvl w:val="0"/>
+          <w:numId w:val="2"/>
+        </w:numPr>
+        <w:spacing w:before="40" w:after="40"/>
+      </w:pPr>
+      <w:r>
+        <w:t>Very few observations exist beyond stop 15, indicating that most NSW train routes have fewer than 15 stops</w:t>
+      </w:r>
+      <w:r>
+        <w:t>.</w:t>
+      </w:r>
+    </w:p>
+    <w:p>
+      <w:pPr>
+        <w:spacing w:before="60" w:after="60"/>
+      </w:pPr>
+    </w:p>
+    <w:p>
+      <w:pPr>
+        <w:spacing w:before="80" w:after="80"/>
+        <w:jc w:val="both"/>
+      </w:pPr>
+      <w:r>
+        <w:rPr>
+          <w:b/>
+          <w:bCs/>
+        </w:rPr>
+        <w:t>Insight:</w:t>
+      </w:r>
+      <w:r>
+        <w:t xml:space="preserve"> Most train services in NSW have fewer than 15 stops, with stop position frequency decreasing as sequence order increases, </w:t>
+      </w:r>
+      <w:r>
+        <w:t>suggesting</w:t>
+      </w:r>
+      <w:r>
+        <w:t xml:space="preserve"> that longer routes are less common in the</w:t>
+      </w:r>
+      <w:r>
+        <w:t xml:space="preserve"> train</w:t>
+      </w:r>
+      <w:r>
+        <w:t xml:space="preserve"> network. </w:t>
+      </w:r>
+      <w:r>
+        <w:rPr>
+          <w:b/>
+          <w:bCs/>
+        </w:rPr>
+        <w:t>This feature is relevant to the research question as occupancy may increase along a route as passengers board.</w:t>
+      </w:r>
+    </w:p>
+    <w:p>
+      <w:pPr>
+        <w:spacing w:before="80" w:after="80"/>
+        <w:jc w:val="both"/>
+      </w:pPr>
+    </w:p>
+    <w:p>
+      <w:pPr>
+        <w:pStyle w:val="Heading3"/>
+      </w:pPr>
+      <w:r>
+        <w:t>4.4 Numerical Feature 2</w:t>
+      </w:r>
+      <w:r>
+        <w:t xml:space="preserve">: </w:t>
+      </w:r>
+      <w:r>
+        <w:t xml:space="preserve"> Day</w:t>
+      </w:r>
+    </w:p>
+    <w:p>
+      <w:pPr>
+        <w:pStyle w:val="Heading3"/>
+      </w:pPr>
+    </w:p>
+    <w:p>
+      <w:pPr>
+        <w:spacing w:before="80" w:after="80"/>
+        <w:jc w:val="both"/>
+      </w:pPr>
+      <w:r>
+        <w:rPr>
+          <w:b/>
+          <w:bCs/>
+        </w:rPr>
+        <w:t>Carried out process:</w:t>
+      </w:r>
+      <w:r>
+        <w:t xml:space="preserve"> Initially a histogram was used to visualize the train services assuming that the day attribute in the dataset represented days of the week instead of calendar dates over the span of 8 days from day 9 to day 16.</w:t>
+      </w:r>
+    </w:p>
+    <w:p>
+      <w:pPr>
+        <w:spacing w:before="80" w:after="80"/>
+        <w:jc w:val="both"/>
+      </w:pPr>
+    </w:p>
+    <w:p>
+      <w:pPr>
+        <w:spacing w:before="80" w:after="80"/>
+        <w:jc w:val="both"/>
+      </w:pPr>
+      <w:r>
+        <w:t xml:space="preserve">Hence, a bar chart was used to </w:t>
+      </w:r>
+      <w:r>
+        <w:t>visualize</w:t>
+      </w:r>
+      <w:r>
+        <w:t xml:space="preserve"> the number of train services recorded per calendar day, providing a clearer view than a histogram given the discrete nature of the day values.</w:t>
+      </w:r>
+    </w:p>
+    <w:p>
+      <w:pPr>
+        <w:spacing w:before="80" w:after="80"/>
+        <w:jc w:val="both"/>
+      </w:pPr>
+    </w:p>
+    <w:p>
+      <w:pPr>
+        <w:spacing w:before="60" w:after="60"/>
+      </w:pPr>
+      <w:r>
+        <w:rPr>
+          <w:noProof/>
+        </w:rPr>
+        <w:lastRenderedPageBreak/>
+        <w:drawing>
+          <wp:inline distT="0" distB="0" distL="0" distR="0" wp14:anchorId="59E2AEED" wp14:editId="16444CD2">
+            <wp:extent cx="5731510" cy="2830195"/>
+            <wp:effectExtent l="0" t="0" r="2540" b="8255"/>
+            <wp:docPr id="1451204760" name="Picture 4"/>
+            <wp:cNvGraphicFramePr>
+              <a:graphicFrameLocks xmlns:a="http://schemas.openxmlformats.org/drawingml/2006/main" noChangeAspect="1"/>
+            </wp:cNvGraphicFramePr>
+            <a:graphic xmlns:a="http://schemas.openxmlformats.org/drawingml/2006/main">
+              <a:graphicData uri="http://schemas.openxmlformats.org/drawingml/2006/picture">
+                <pic:pic xmlns:pic="http://schemas.openxmlformats.org/drawingml/2006/picture">
+                  <pic:nvPicPr>
+                    <pic:cNvPr id="1451204760" name="Picture 1451204760"/>
+                    <pic:cNvPicPr/>
+                  </pic:nvPicPr>
+                  <pic:blipFill>
+                    <a:blip r:embed="rId9">
+                      <a:extLst>
+                        <a:ext uri="{28A0092B-C50C-407E-A947-70E740481C1C}">
+                          <a14:useLocalDpi xmlns:a14="http://schemas.microsoft.com/office/drawing/2010/main" val="0"/>
+                        </a:ext>
+                      </a:extLst>
+                    </a:blip>
+                    <a:stretch>
+                      <a:fillRect/>
+                    </a:stretch>
+                  </pic:blipFill>
+                  <pic:spPr>
+                    <a:xfrm>
+                      <a:off x="0" y="0"/>
+                      <a:ext cx="5731510" cy="2830195"/>
+                    </a:xfrm>
+                    <a:prstGeom prst="rect">
+                      <a:avLst/>
+                    </a:prstGeom>
+                  </pic:spPr>
+                </pic:pic>
+              </a:graphicData>
+            </a:graphic>
+          </wp:inline>
+        </w:drawing>
+      </w:r>
+    </w:p>
+    <w:p>
+      <w:pPr>
         <w:spacing w:before="40" w:after="120"/>
         <w:jc w:val="center"/>
         <w:rPr>
@@ -5050,7 +5055,21 @@
           <w:i/>
           <w:iCs/>
         </w:rPr>
-        <w:t>Figure 6: Correlation matrix between day and Node.Seq.Order</w:t>
+        <w:t xml:space="preserve">Figure </w:t>
+      </w:r>
+      <w:r>
+        <w:rPr>
+          <w:i/>
+          <w:iCs/>
+        </w:rPr>
+        <w:t>4</w:t>
+      </w:r>
+      <w:r>
+        <w:rPr>
+          <w:i/>
+          <w:iCs/>
+        </w:rPr>
+        <w:t>: Number of train services recorded per calendar day (days 9–16)</w:t>
       </w:r>
     </w:p>
     <w:p>
@@ -5065,22 +5084,226 @@
     </w:p>
     <w:p>
       <w:pPr>
-        <w:spacing w:before="40" w:after="120"/>
-        <w:jc w:val="center"/>
+        <w:pStyle w:val="ListParagraph"/>
+        <w:numPr>
+          <w:ilvl w:val="0"/>
+          <w:numId w:val="2"/>
+        </w:numPr>
+        <w:spacing w:before="40" w:after="40"/>
+      </w:pPr>
+      <w:r>
+        <w:t>Day 9: Very few services</w:t>
+      </w:r>
+      <w:r>
+        <w:t xml:space="preserve"> were recorded assuming the data collection had just started.</w:t>
+      </w:r>
+      <w:r>
+        <w:t xml:space="preserve"> </w:t>
+      </w:r>
+    </w:p>
+    <w:p>
+      <w:pPr>
+        <w:pStyle w:val="ListParagraph"/>
+        <w:numPr>
+          <w:ilvl w:val="0"/>
+          <w:numId w:val="2"/>
+        </w:numPr>
+        <w:spacing w:before="40" w:after="40"/>
+      </w:pPr>
+      <w:r>
+        <w:t>Days 10–13: Consistently ~8,000 services each weekday operations</w:t>
+      </w:r>
+      <w:r>
+        <w:t xml:space="preserve"> were observed.</w:t>
+      </w:r>
+    </w:p>
+    <w:p>
+      <w:pPr>
+        <w:pStyle w:val="ListParagraph"/>
+        <w:numPr>
+          <w:ilvl w:val="0"/>
+          <w:numId w:val="2"/>
+        </w:numPr>
+        <w:spacing w:before="40" w:after="40"/>
+      </w:pPr>
+      <w:r>
+        <w:t>Day 14: ~5,000 services</w:t>
+      </w:r>
+      <w:r>
+        <w:t>,</w:t>
+      </w:r>
+      <w:r>
+        <w:t xml:space="preserve"> consistent with a Saturday (fewer commuter services)</w:t>
+      </w:r>
+      <w:r>
+        <w:t>.</w:t>
+      </w:r>
+    </w:p>
+    <w:p>
+      <w:pPr>
+        <w:pStyle w:val="ListParagraph"/>
+        <w:numPr>
+          <w:ilvl w:val="0"/>
+          <w:numId w:val="2"/>
+        </w:numPr>
+        <w:spacing w:before="40" w:after="40"/>
+      </w:pPr>
+      <w:r>
+        <w:t>Days 15–16: Combined ~12,500 services</w:t>
+      </w:r>
+      <w:r>
+        <w:t xml:space="preserve"> </w:t>
+      </w:r>
+      <w:r>
+        <w:t>covering Sunday and the return to Monday</w:t>
+      </w:r>
+      <w:r>
+        <w:t>.</w:t>
+      </w:r>
+    </w:p>
+    <w:p>
+      <w:pPr>
+        <w:spacing w:before="60" w:after="60"/>
+      </w:pPr>
+    </w:p>
+    <w:p>
+      <w:pPr>
+        <w:spacing w:before="80" w:after="80"/>
+        <w:jc w:val="both"/>
+      </w:pPr>
+      <w:r>
         <w:rPr>
-          <w:i/>
-          <w:iCs/>
+          <w:b/>
+          <w:bCs/>
         </w:rPr>
-      </w:pPr>
+        <w:t>Insight:</w:t>
+      </w:r>
+      <w:r>
+        <w:t xml:space="preserve"> The day column represents calendar dates rather than day-of-week numbers. The dataset spans 8 days of train service records. Weekday services (days 10</w:t>
+      </w:r>
+      <w:r>
+        <w:t xml:space="preserve"> to </w:t>
+      </w:r>
+      <w:r>
+        <w:t>13, 16) averaged approximately 7,900 train services per day, while weekend services (days 14</w:t>
+      </w:r>
+      <w:r>
+        <w:t xml:space="preserve"> to </w:t>
+      </w:r>
+      <w:r>
+        <w:t>15) averaged only 5,100</w:t>
+      </w:r>
+      <w:r>
+        <w:t xml:space="preserve">, </w:t>
+      </w:r>
+      <w:r>
+        <w:t>implying ab</w:t>
+      </w:r>
+      <w:r>
+        <w:t>out 35% fewer services on weekends, reflecting lower commuter demand.</w:t>
+      </w:r>
     </w:p>
     <w:p>
       <w:pPr>
         <w:spacing w:before="60" w:after="60"/>
+      </w:pPr>
+    </w:p>
+    <w:p>
+      <w:pPr>
+        <w:pStyle w:val="Heading3"/>
+      </w:pPr>
+    </w:p>
+    <w:p>
+      <w:pPr>
+        <w:pStyle w:val="Heading3"/>
+      </w:pPr>
+    </w:p>
+    <w:p>
+      <w:pPr>
+        <w:pStyle w:val="Heading3"/>
+      </w:pPr>
+    </w:p>
+    <w:p>
+      <w:pPr>
+        <w:pStyle w:val="Heading3"/>
+      </w:pPr>
+    </w:p>
+    <w:p>
+      <w:pPr>
+        <w:pStyle w:val="Heading3"/>
+      </w:pPr>
+    </w:p>
+    <w:p>
+      <w:pPr>
+        <w:pStyle w:val="Heading3"/>
+      </w:pPr>
+    </w:p>
+    <w:p>
+      <w:pPr>
+        <w:pStyle w:val="Heading3"/>
+      </w:pPr>
+    </w:p>
+    <w:p>
+      <w:pPr>
+        <w:pStyle w:val="Heading3"/>
+      </w:pPr>
+    </w:p>
+    <w:p>
+      <w:pPr>
+        <w:pStyle w:val="Heading3"/>
+      </w:pPr>
+    </w:p>
+    <w:p>
+      <w:pPr>
+        <w:pStyle w:val="Heading3"/>
+      </w:pPr>
+    </w:p>
+    <w:p>
+      <w:pPr>
+        <w:pStyle w:val="Heading3"/>
+      </w:pPr>
+      <w:r>
+        <w:lastRenderedPageBreak/>
+        <w:t>4.5 Correlation Between Numerical Features</w:t>
+      </w:r>
+    </w:p>
+    <w:p>
+      <w:pPr>
+        <w:spacing w:before="80" w:after="80"/>
+        <w:jc w:val="both"/>
+      </w:pPr>
+      <w:r>
+        <w:t>A correlation matrix was computed between the two numerical features</w:t>
+      </w:r>
+      <w:r>
+        <w:t xml:space="preserve">: </w:t>
+      </w:r>
+      <w:r>
+        <w:t xml:space="preserve">day and </w:t>
+      </w:r>
+      <w:proofErr w:type="spellStart"/>
+      <w:proofErr w:type="gramStart"/>
+      <w:r>
+        <w:t>Node.Seq.Order</w:t>
+      </w:r>
+      <w:proofErr w:type="spellEnd"/>
+      <w:proofErr w:type="gramEnd"/>
+      <w:r>
+        <w:t xml:space="preserve">, </w:t>
+      </w:r>
+      <w:r>
+        <w:t>to assess any linear relationship between them.</w:t>
+      </w:r>
+    </w:p>
+    <w:p>
+      <w:pPr>
+        <w:spacing w:before="80" w:after="80"/>
+        <w:jc w:val="both"/>
       </w:pPr>
     </w:p>
     <w:tbl>
       <w:tblPr>
-        <w:tblW w:w="9026" w:type="dxa"/>
+        <w:tblW w:w="9286" w:type="dxa"/>
         <w:tblBorders>
           <w:top w:val="single" w:sz="4" w:space="0" w:color="auto"/>
           <w:left w:val="single" w:sz="4" w:space="0" w:color="auto"/>
@@ -5096,14 +5319,17 @@
         <w:tblLook w:val="04A0" w:firstRow="1" w:lastRow="0" w:firstColumn="1" w:lastColumn="0" w:noHBand="0" w:noVBand="1"/>
       </w:tblPr>
       <w:tblGrid>
-        <w:gridCol w:w="3000"/>
-        <w:gridCol w:w="2500"/>
-        <w:gridCol w:w="3526"/>
+        <w:gridCol w:w="3086"/>
+        <w:gridCol w:w="2572"/>
+        <w:gridCol w:w="3628"/>
       </w:tblGrid>
       <w:tr>
-        <w:tc>
-          <w:tcPr>
-            <w:tcW w:w="3000" w:type="dxa"/>
+        <w:trPr>
+          <w:trHeight w:val="439"/>
+        </w:trPr>
+        <w:tc>
+          <w:tcPr>
+            <w:tcW w:w="3086" w:type="dxa"/>
             <w:tcBorders>
               <w:top w:val="single" w:sz="1" w:space="0" w:color="CCCCCC"/>
               <w:left w:val="single" w:sz="1" w:space="0" w:color="CCCCCC"/>
@@ -5133,7 +5359,7 @@
         </w:tc>
         <w:tc>
           <w:tcPr>
-            <w:tcW w:w="2500" w:type="dxa"/>
+            <w:tcW w:w="2572" w:type="dxa"/>
             <w:tcBorders>
               <w:top w:val="single" w:sz="1" w:space="0" w:color="CCCCCC"/>
               <w:left w:val="single" w:sz="1" w:space="0" w:color="CCCCCC"/>
@@ -5163,7 +5389,7 @@
         </w:tc>
         <w:tc>
           <w:tcPr>
-            <w:tcW w:w="3526" w:type="dxa"/>
+            <w:tcW w:w="3628" w:type="dxa"/>
             <w:tcBorders>
               <w:top w:val="single" w:sz="1" w:space="0" w:color="CCCCCC"/>
               <w:left w:val="single" w:sz="1" w:space="0" w:color="CCCCCC"/>
@@ -5193,9 +5419,12 @@
         </w:tc>
       </w:tr>
       <w:tr>
-        <w:tc>
-          <w:tcPr>
-            <w:tcW w:w="3000" w:type="dxa"/>
+        <w:trPr>
+          <w:trHeight w:val="415"/>
+        </w:trPr>
+        <w:tc>
+          <w:tcPr>
+            <w:tcW w:w="3086" w:type="dxa"/>
             <w:tcBorders>
               <w:top w:val="single" w:sz="1" w:space="0" w:color="CCCCCC"/>
               <w:left w:val="single" w:sz="1" w:space="0" w:color="CCCCCC"/>
@@ -5216,13 +5445,24 @@
                 <w:sz w:val="20"/>
                 <w:szCs w:val="20"/>
               </w:rPr>
-              <w:t>day vs Node.Seq.Order</w:t>
-            </w:r>
-          </w:p>
-        </w:tc>
-        <w:tc>
-          <w:tcPr>
-            <w:tcW w:w="2500" w:type="dxa"/>
+              <w:t xml:space="preserve">day vs </w:t>
+            </w:r>
+            <w:proofErr w:type="spellStart"/>
+            <w:proofErr w:type="gramStart"/>
+            <w:r>
+              <w:rPr>
+                <w:sz w:val="20"/>
+                <w:szCs w:val="20"/>
+              </w:rPr>
+              <w:t>Node.Seq.Order</w:t>
+            </w:r>
+            <w:proofErr w:type="spellEnd"/>
+            <w:proofErr w:type="gramEnd"/>
+          </w:p>
+        </w:tc>
+        <w:tc>
+          <w:tcPr>
+            <w:tcW w:w="2572" w:type="dxa"/>
             <w:tcBorders>
               <w:top w:val="single" w:sz="1" w:space="0" w:color="CCCCCC"/>
               <w:left w:val="single" w:sz="1" w:space="0" w:color="CCCCCC"/>
@@ -5249,7 +5489,7 @@
         </w:tc>
         <w:tc>
           <w:tcPr>
-            <w:tcW w:w="3526" w:type="dxa"/>
+            <w:tcW w:w="3628" w:type="dxa"/>
             <w:tcBorders>
               <w:top w:val="single" w:sz="1" w:space="0" w:color="CCCCCC"/>
               <w:left w:val="single" w:sz="1" w:space="0" w:color="CCCCCC"/>
@@ -5276,9 +5516,12 @@
         </w:tc>
       </w:tr>
       <w:tr>
-        <w:tc>
-          <w:tcPr>
-            <w:tcW w:w="3000" w:type="dxa"/>
+        <w:trPr>
+          <w:trHeight w:val="439"/>
+        </w:trPr>
+        <w:tc>
+          <w:tcPr>
+            <w:tcW w:w="3086" w:type="dxa"/>
             <w:tcBorders>
               <w:top w:val="single" w:sz="1" w:space="0" w:color="CCCCCC"/>
               <w:left w:val="single" w:sz="1" w:space="0" w:color="CCCCCC"/>
@@ -5305,7 +5548,7 @@
         </w:tc>
         <w:tc>
           <w:tcPr>
-            <w:tcW w:w="2500" w:type="dxa"/>
+            <w:tcW w:w="2572" w:type="dxa"/>
             <w:tcBorders>
               <w:top w:val="single" w:sz="1" w:space="0" w:color="CCCCCC"/>
               <w:left w:val="single" w:sz="1" w:space="0" w:color="CCCCCC"/>
@@ -5332,7 +5575,7 @@
         </w:tc>
         <w:tc>
           <w:tcPr>
-            <w:tcW w:w="3526" w:type="dxa"/>
+            <w:tcW w:w="3628" w:type="dxa"/>
             <w:tcBorders>
               <w:top w:val="single" w:sz="1" w:space="0" w:color="CCCCCC"/>
               <w:left w:val="single" w:sz="1" w:space="0" w:color="CCCCCC"/>
@@ -5359,9 +5602,12 @@
         </w:tc>
       </w:tr>
       <w:tr>
-        <w:tc>
-          <w:tcPr>
-            <w:tcW w:w="3000" w:type="dxa"/>
+        <w:trPr>
+          <w:trHeight w:val="880"/>
+        </w:trPr>
+        <w:tc>
+          <w:tcPr>
+            <w:tcW w:w="3086" w:type="dxa"/>
             <w:tcBorders>
               <w:top w:val="single" w:sz="1" w:space="0" w:color="CCCCCC"/>
               <w:left w:val="single" w:sz="1" w:space="0" w:color="CCCCCC"/>
@@ -5377,18 +5623,40 @@
             </w:tcMar>
           </w:tcPr>
           <w:p>
-            <w:r>
-              <w:rPr>
-                <w:sz w:val="20"/>
-                <w:szCs w:val="20"/>
-              </w:rPr>
-              <w:t>Node.Seq.Order vs Node.Seq.Order</w:t>
-            </w:r>
-          </w:p>
-        </w:tc>
-        <w:tc>
-          <w:tcPr>
-            <w:tcW w:w="2500" w:type="dxa"/>
+            <w:proofErr w:type="spellStart"/>
+            <w:proofErr w:type="gramStart"/>
+            <w:r>
+              <w:rPr>
+                <w:sz w:val="20"/>
+                <w:szCs w:val="20"/>
+              </w:rPr>
+              <w:t>Node.Seq.Order</w:t>
+            </w:r>
+            <w:proofErr w:type="spellEnd"/>
+            <w:proofErr w:type="gramEnd"/>
+            <w:r>
+              <w:rPr>
+                <w:sz w:val="20"/>
+                <w:szCs w:val="20"/>
+              </w:rPr>
+              <w:t xml:space="preserve"> vs </w:t>
+            </w:r>
+            <w:proofErr w:type="spellStart"/>
+            <w:proofErr w:type="gramStart"/>
+            <w:r>
+              <w:rPr>
+                <w:sz w:val="20"/>
+                <w:szCs w:val="20"/>
+              </w:rPr>
+              <w:t>Node.Seq.Order</w:t>
+            </w:r>
+            <w:proofErr w:type="spellEnd"/>
+            <w:proofErr w:type="gramEnd"/>
+          </w:p>
+        </w:tc>
+        <w:tc>
+          <w:tcPr>
+            <w:tcW w:w="2572" w:type="dxa"/>
             <w:tcBorders>
               <w:top w:val="single" w:sz="1" w:space="0" w:color="CCCCCC"/>
               <w:left w:val="single" w:sz="1" w:space="0" w:color="CCCCCC"/>
@@ -5415,7 +5683,7 @@
         </w:tc>
         <w:tc>
           <w:tcPr>
-            <w:tcW w:w="3526" w:type="dxa"/>
+            <w:tcW w:w="3628" w:type="dxa"/>
             <w:tcBorders>
               <w:top w:val="single" w:sz="1" w:space="0" w:color="CCCCCC"/>
               <w:left w:val="single" w:sz="1" w:space="0" w:color="CCCCCC"/>
@@ -5453,7 +5721,17 @@
         <w:jc w:val="both"/>
       </w:pPr>
       <w:r>
-        <w:t xml:space="preserve">Insight: The correlation between day and Node.Seq.Order is -0.009, </w:t>
+        <w:t xml:space="preserve">Insight: The correlation between day and </w:t>
+      </w:r>
+      <w:proofErr w:type="spellStart"/>
+      <w:proofErr w:type="gramStart"/>
+      <w:r>
+        <w:t>Node.Seq.Order</w:t>
+      </w:r>
+      <w:proofErr w:type="spellEnd"/>
+      <w:proofErr w:type="gramEnd"/>
+      <w:r>
+        <w:t xml:space="preserve"> is -0.009, </w:t>
       </w:r>
       <w:r>
         <w:t>indicating virtually no linear relationship</w:t>
@@ -5468,32 +5746,11 @@
         <w:t xml:space="preserve"> as</w:t>
       </w:r>
       <w:r>
-        <w:t xml:space="preserve"> the route structure of a train does not change based on the calendar day. These two features are therefore independent and can both be used as input features in Stage 2 modelling without multicollinearity concerns.</w:t>
-      </w:r>
-    </w:p>
-    <w:p>
-      <w:pPr>
-        <w:spacing w:before="80" w:after="80"/>
-        <w:jc w:val="both"/>
-      </w:pPr>
-    </w:p>
-    <w:p>
-      <w:pPr>
-        <w:spacing w:before="80" w:after="80"/>
-        <w:jc w:val="both"/>
-      </w:pPr>
-    </w:p>
-    <w:p>
-      <w:pPr>
-        <w:spacing w:before="80" w:after="80"/>
-        <w:jc w:val="both"/>
-      </w:pPr>
-    </w:p>
-    <w:p>
-      <w:pPr>
-        <w:spacing w:before="80" w:after="80"/>
-        <w:jc w:val="both"/>
-      </w:pPr>
+        <w:t xml:space="preserve"> the route structure of a train does not change based on the calendar day. These two features are therefore independent and can both be used as input features in Stage 2 modelling without multicollinearity concerns</w:t>
+      </w:r>
+      <w:r>
+        <w:t>.</w:t>
+      </w:r>
     </w:p>
     <w:p>
       <w:pPr>
@@ -5505,13 +5762,12 @@
         <w:pStyle w:val="Heading3"/>
       </w:pPr>
       <w:r>
-        <w:lastRenderedPageBreak/>
         <w:t>4.6 Summary of EDA Findings</w:t>
       </w:r>
     </w:p>
     <w:tbl>
       <w:tblPr>
-        <w:tblW w:w="9169" w:type="dxa"/>
+        <w:tblW w:w="9358" w:type="dxa"/>
         <w:tblBorders>
           <w:top w:val="single" w:sz="4" w:space="0" w:color="auto"/>
           <w:left w:val="single" w:sz="4" w:space="0" w:color="auto"/>
@@ -5527,17 +5783,17 @@
         <w:tblLook w:val="04A0" w:firstRow="1" w:lastRow="0" w:firstColumn="1" w:lastColumn="0" w:noHBand="0" w:noVBand="1"/>
       </w:tblPr>
       <w:tblGrid>
-        <w:gridCol w:w="2235"/>
-        <w:gridCol w:w="1828"/>
-        <w:gridCol w:w="5106"/>
+        <w:gridCol w:w="2281"/>
+        <w:gridCol w:w="1865"/>
+        <w:gridCol w:w="5212"/>
       </w:tblGrid>
       <w:tr>
         <w:trPr>
-          <w:trHeight w:val="259"/>
+          <w:trHeight w:val="352"/>
         </w:trPr>
         <w:tc>
           <w:tcPr>
-            <w:tcW w:w="2235" w:type="dxa"/>
+            <w:tcW w:w="2281" w:type="dxa"/>
             <w:tcBorders>
               <w:top w:val="single" w:sz="1" w:space="0" w:color="CCCCCC"/>
               <w:left w:val="single" w:sz="1" w:space="0" w:color="CCCCCC"/>
@@ -5567,7 +5823,7 @@
         </w:tc>
         <w:tc>
           <w:tcPr>
-            <w:tcW w:w="1828" w:type="dxa"/>
+            <w:tcW w:w="1865" w:type="dxa"/>
             <w:tcBorders>
               <w:top w:val="single" w:sz="1" w:space="0" w:color="CCCCCC"/>
               <w:left w:val="single" w:sz="1" w:space="0" w:color="CCCCCC"/>
@@ -5597,7 +5853,7 @@
         </w:tc>
         <w:tc>
           <w:tcPr>
-            <w:tcW w:w="5106" w:type="dxa"/>
+            <w:tcW w:w="5212" w:type="dxa"/>
             <w:tcBorders>
               <w:top w:val="single" w:sz="1" w:space="0" w:color="CCCCCC"/>
               <w:left w:val="single" w:sz="1" w:space="0" w:color="CCCCCC"/>
@@ -5628,11 +5884,11 @@
       </w:tr>
       <w:tr>
         <w:trPr>
-          <w:trHeight w:val="505"/>
+          <w:trHeight w:val="687"/>
         </w:trPr>
         <w:tc>
           <w:tcPr>
-            <w:tcW w:w="2235" w:type="dxa"/>
+            <w:tcW w:w="2281" w:type="dxa"/>
             <w:tcBorders>
               <w:top w:val="single" w:sz="1" w:space="0" w:color="CCCCCC"/>
               <w:left w:val="single" w:sz="1" w:space="0" w:color="CCCCCC"/>
@@ -5659,7 +5915,7 @@
         </w:tc>
         <w:tc>
           <w:tcPr>
-            <w:tcW w:w="1828" w:type="dxa"/>
+            <w:tcW w:w="1865" w:type="dxa"/>
             <w:tcBorders>
               <w:top w:val="single" w:sz="1" w:space="0" w:color="CCCCCC"/>
               <w:left w:val="single" w:sz="1" w:space="0" w:color="CCCCCC"/>
@@ -5686,7 +5942,7 @@
         </w:tc>
         <w:tc>
           <w:tcPr>
-            <w:tcW w:w="5106" w:type="dxa"/>
+            <w:tcW w:w="5212" w:type="dxa"/>
             <w:tcBorders>
               <w:top w:val="single" w:sz="1" w:space="0" w:color="CCCCCC"/>
               <w:left w:val="single" w:sz="1" w:space="0" w:color="CCCCCC"/>
@@ -5756,11 +6012,11 @@
       </w:tr>
       <w:tr>
         <w:trPr>
-          <w:trHeight w:val="518"/>
+          <w:trHeight w:val="704"/>
         </w:trPr>
         <w:tc>
           <w:tcPr>
-            <w:tcW w:w="2235" w:type="dxa"/>
+            <w:tcW w:w="2281" w:type="dxa"/>
             <w:tcBorders>
               <w:top w:val="single" w:sz="1" w:space="0" w:color="CCCCCC"/>
               <w:left w:val="single" w:sz="1" w:space="0" w:color="CCCCCC"/>
@@ -5776,6 +6032,7 @@
             </w:tcMar>
           </w:tcPr>
           <w:p>
+            <w:proofErr w:type="spellStart"/>
             <w:r>
               <w:rPr>
                 <w:sz w:val="20"/>
@@ -5783,11 +6040,12 @@
               </w:rPr>
               <w:t>Segment.Direction</w:t>
             </w:r>
-          </w:p>
-        </w:tc>
-        <w:tc>
-          <w:tcPr>
-            <w:tcW w:w="1828" w:type="dxa"/>
+            <w:proofErr w:type="spellEnd"/>
+          </w:p>
+        </w:tc>
+        <w:tc>
+          <w:tcPr>
+            <w:tcW w:w="1865" w:type="dxa"/>
             <w:tcBorders>
               <w:top w:val="single" w:sz="1" w:space="0" w:color="CCCCCC"/>
               <w:left w:val="single" w:sz="1" w:space="0" w:color="CCCCCC"/>
@@ -5814,7 +6072,7 @@
         </w:tc>
         <w:tc>
           <w:tcPr>
-            <w:tcW w:w="5106" w:type="dxa"/>
+            <w:tcW w:w="5212" w:type="dxa"/>
             <w:tcBorders>
               <w:top w:val="single" w:sz="1" w:space="0" w:color="CCCCCC"/>
               <w:left w:val="single" w:sz="1" w:space="0" w:color="CCCCCC"/>
@@ -5863,11 +6121,11 @@
       </w:tr>
       <w:tr>
         <w:trPr>
-          <w:trHeight w:val="518"/>
+          <w:trHeight w:val="704"/>
         </w:trPr>
         <w:tc>
           <w:tcPr>
-            <w:tcW w:w="2235" w:type="dxa"/>
+            <w:tcW w:w="2281" w:type="dxa"/>
             <w:tcBorders>
               <w:top w:val="single" w:sz="1" w:space="0" w:color="CCCCCC"/>
               <w:left w:val="single" w:sz="1" w:space="0" w:color="CCCCCC"/>
@@ -5883,6 +6141,8 @@
             </w:tcMar>
           </w:tcPr>
           <w:p>
+            <w:proofErr w:type="spellStart"/>
+            <w:proofErr w:type="gramStart"/>
             <w:r>
               <w:rPr>
                 <w:sz w:val="20"/>
@@ -5890,11 +6150,13 @@
               </w:rPr>
               <w:t>Node.Seq.Order</w:t>
             </w:r>
-          </w:p>
-        </w:tc>
-        <w:tc>
-          <w:tcPr>
-            <w:tcW w:w="1828" w:type="dxa"/>
+            <w:proofErr w:type="spellEnd"/>
+            <w:proofErr w:type="gramEnd"/>
+          </w:p>
+        </w:tc>
+        <w:tc>
+          <w:tcPr>
+            <w:tcW w:w="1865" w:type="dxa"/>
             <w:tcBorders>
               <w:top w:val="single" w:sz="1" w:space="0" w:color="CCCCCC"/>
               <w:left w:val="single" w:sz="1" w:space="0" w:color="CCCCCC"/>
@@ -5921,7 +6183,7 @@
         </w:tc>
         <w:tc>
           <w:tcPr>
-            <w:tcW w:w="5106" w:type="dxa"/>
+            <w:tcW w:w="5212" w:type="dxa"/>
             <w:tcBorders>
               <w:top w:val="single" w:sz="1" w:space="0" w:color="CCCCCC"/>
               <w:left w:val="single" w:sz="1" w:space="0" w:color="CCCCCC"/>
@@ -5977,11 +6239,11 @@
       </w:tr>
       <w:tr>
         <w:trPr>
-          <w:trHeight w:val="518"/>
+          <w:trHeight w:val="704"/>
         </w:trPr>
         <w:tc>
           <w:tcPr>
-            <w:tcW w:w="2235" w:type="dxa"/>
+            <w:tcW w:w="2281" w:type="dxa"/>
             <w:tcBorders>
               <w:top w:val="single" w:sz="1" w:space="0" w:color="CCCCCC"/>
               <w:left w:val="single" w:sz="1" w:space="0" w:color="CCCCCC"/>
@@ -6008,7 +6270,7 @@
         </w:tc>
         <w:tc>
           <w:tcPr>
-            <w:tcW w:w="1828" w:type="dxa"/>
+            <w:tcW w:w="1865" w:type="dxa"/>
             <w:tcBorders>
               <w:top w:val="single" w:sz="1" w:space="0" w:color="CCCCCC"/>
               <w:left w:val="single" w:sz="1" w:space="0" w:color="CCCCCC"/>
@@ -6035,7 +6297,7 @@
         </w:tc>
         <w:tc>
           <w:tcPr>
-            <w:tcW w:w="5106" w:type="dxa"/>
+            <w:tcW w:w="5212" w:type="dxa"/>
             <w:tcBorders>
               <w:top w:val="single" w:sz="1" w:space="0" w:color="CCCCCC"/>
               <w:left w:val="single" w:sz="1" w:space="0" w:color="CCCCCC"/>
@@ -6098,11 +6360,11 @@
       </w:tr>
       <w:tr>
         <w:trPr>
-          <w:trHeight w:val="518"/>
+          <w:trHeight w:val="704"/>
         </w:trPr>
         <w:tc>
           <w:tcPr>
-            <w:tcW w:w="2235" w:type="dxa"/>
+            <w:tcW w:w="2281" w:type="dxa"/>
             <w:tcBorders>
               <w:top w:val="single" w:sz="1" w:space="0" w:color="CCCCCC"/>
               <w:left w:val="single" w:sz="1" w:space="0" w:color="CCCCCC"/>
@@ -6123,13 +6385,24 @@
                 <w:sz w:val="20"/>
                 <w:szCs w:val="20"/>
               </w:rPr>
-              <w:t>day vs Node.Seq.Order</w:t>
-            </w:r>
-          </w:p>
-        </w:tc>
-        <w:tc>
-          <w:tcPr>
-            <w:tcW w:w="1828" w:type="dxa"/>
+              <w:t xml:space="preserve">day vs </w:t>
+            </w:r>
+            <w:proofErr w:type="spellStart"/>
+            <w:proofErr w:type="gramStart"/>
+            <w:r>
+              <w:rPr>
+                <w:sz w:val="20"/>
+                <w:szCs w:val="20"/>
+              </w:rPr>
+              <w:t>Node.Seq.Order</w:t>
+            </w:r>
+            <w:proofErr w:type="spellEnd"/>
+            <w:proofErr w:type="gramEnd"/>
+          </w:p>
+        </w:tc>
+        <w:tc>
+          <w:tcPr>
+            <w:tcW w:w="1865" w:type="dxa"/>
             <w:tcBorders>
               <w:top w:val="single" w:sz="1" w:space="0" w:color="CCCCCC"/>
               <w:left w:val="single" w:sz="1" w:space="0" w:color="CCCCCC"/>
@@ -6156,7 +6429,7 @@
         </w:tc>
         <w:tc>
           <w:tcPr>
-            <w:tcW w:w="5106" w:type="dxa"/>
+            <w:tcW w:w="5212" w:type="dxa"/>
             <w:tcBorders>
               <w:top w:val="single" w:sz="1" w:space="0" w:color="CCCCCC"/>
               <w:left w:val="single" w:sz="1" w:space="0" w:color="CCCCCC"/>
@@ -6206,6 +6479,11 @@
     </w:tbl>
     <w:p/>
     <w:p/>
+    <w:p/>
+    <w:p/>
+    <w:p/>
+    <w:p/>
+    <w:p/>
     <w:p>
       <w:pPr>
         <w:pStyle w:val="Heading1"/>
@@ -6214,6 +6492,7 @@
         </w:pBdr>
       </w:pPr>
       <w:r>
+        <w:lastRenderedPageBreak/>
         <w:t xml:space="preserve">AI ACKNOWLEDGMENT </w:t>
       </w:r>
     </w:p>
@@ -6238,6 +6517,7 @@
         </w:rPr>
         <w:t xml:space="preserve">I used Claude (Anthropic) from 28–31 March 2026 to assist with structuring the report layout and understanding how to phrase data insights. All </w:t>
       </w:r>
+      <w:proofErr w:type="gramStart"/>
       <w:r>
         <w:rPr>
           <w:sz w:val="28"/>
@@ -6250,7 +6530,15 @@
           <w:sz w:val="28"/>
           <w:szCs w:val="28"/>
         </w:rPr>
-        <w:t xml:space="preserve">, </w:t>
+        <w:t>,</w:t>
+      </w:r>
+      <w:proofErr w:type="gramEnd"/>
+      <w:r>
+        <w:rPr>
+          <w:sz w:val="28"/>
+          <w:szCs w:val="28"/>
+        </w:rPr>
+        <w:t xml:space="preserve"> </w:t>
       </w:r>
       <w:r>
         <w:rPr>

</xml_diff>